<commit_message>
Update WW vs NetSuite WMS analysis docx
Replace the WW-vs-NetSuite-WMS-Analysis-Client v.docx with an updated binary version and remove the temporary Office lock file (~$-vs-NetSuite-WMS-Analysis-Client v.docx) that was deleted.
</commit_message>
<xml_diff>
--- a/WW-vs-NetSuite-WMS-Analysis-Client v.docx
+++ b/WW-vs-NetSuite-WMS-Analysis-Client v.docx
@@ -4224,23 +4224,6 @@
               <w:t>Return authorization receiving workflow</w:t>
             </w:r>
           </w:p>
-          <w:p>
-            <w:pPr>
-              <w:pStyle w:val="ListParagraph"/>
-              <w:numPr>
-                <w:ilvl w:val="0"/>
-                <w:numId w:val="2"/>
-              </w:numPr>
-              <w:spacing w:before="30" w:after="30"/>
-            </w:pPr>
-            <w:r>
-              <w:rPr>
-                <w:sz w:val="20"/>
-                <w:szCs w:val="20"/>
-              </w:rPr>
-              <w:t>Native iOS/Android mobile app</w:t>
-            </w:r>
-          </w:p>
         </w:tc>
       </w:tr>
     </w:tbl>
@@ -4294,3486 +4277,20 @@
           <w:sz w:val="18"/>
           <w:szCs w:val="18"/>
         </w:rPr>
-        <w:t xml:space="preserve">   |   May 2026</w:t>
-      </w:r>
-    </w:p>
-    <w:p>
-      <w:pPr>
-        <w:sectPr>
-          <w:headerReference w:type="default" r:id="rId8"/>
-          <w:footerReference w:type="default" r:id="rId9"/>
-          <w:pgSz w:w="12240" w:h="15840"/>
-          <w:pgMar w:top="1080" w:right="1080" w:bottom="1080" w:left="1080" w:header="708" w:footer="708" w:gutter="0"/>
-          <w:cols w:space="720"/>
-          <w:docGrid w:linePitch="360"/>
-        </w:sectPr>
-      </w:pPr>
-    </w:p>
-    <w:p>
-      <w:pPr>
-        <w:spacing w:before="3000"/>
-      </w:pPr>
-    </w:p>
-    <w:p>
-      <w:pPr>
-        <w:pBdr>
-          <w:top w:val="single" w:sz="6" w:space="1" w:color="CCCCCC"/>
-          <w:bottom w:val="single" w:sz="6" w:space="1" w:color="CCCCCC"/>
-        </w:pBdr>
-        <w:spacing w:before="200" w:after="200"/>
-        <w:jc w:val="center"/>
-      </w:pPr>
-      <w:r>
-        <w:rPr>
-          <w:b/>
-          <w:bCs/>
-          <w:color w:val="CCCCCC"/>
-          <w:sz w:val="32"/>
-          <w:szCs w:val="32"/>
-        </w:rPr>
-        <w:t>PART 2 — DEVELOPER GUIDE</w:t>
-      </w:r>
-    </w:p>
-    <w:p>
-      <w:pPr>
-        <w:spacing w:before="120"/>
-        <w:jc w:val="center"/>
-      </w:pPr>
-      <w:r>
-        <w:rPr>
-          <w:i/>
-          <w:iCs/>
-          <w:color w:val="CCCCCC"/>
-        </w:rPr>
-        <w:t>Gap-Closing Technical Specifications</w:t>
-      </w:r>
-    </w:p>
-    <w:p>
-      <w:pPr>
-        <w:sectPr>
-          <w:pgSz w:w="12240" w:h="15840"/>
-          <w:pgMar w:top="1080" w:right="1080" w:bottom="1080" w:left="1080" w:header="708" w:footer="708" w:gutter="0"/>
-          <w:cols w:space="720"/>
-          <w:docGrid w:linePitch="360"/>
-        </w:sectPr>
-      </w:pPr>
-    </w:p>
-    <w:p>
-      <w:pPr>
-        <w:spacing w:before="480" w:after="60"/>
-      </w:pPr>
-      <w:r>
-        <w:rPr>
-          <w:b/>
-          <w:bCs/>
-          <w:color w:val="1A3C5E"/>
-          <w:sz w:val="52"/>
-          <w:szCs w:val="52"/>
-        </w:rPr>
-        <w:lastRenderedPageBreak/>
-        <w:t>Developer Gap-Closing Guide</w:t>
-      </w:r>
-    </w:p>
-    <w:p>
-      <w:pPr>
-        <w:spacing w:after="80"/>
-      </w:pPr>
-      <w:r>
-        <w:rPr>
-          <w:i/>
-          <w:iCs/>
-          <w:color w:val="666666"/>
-          <w:sz w:val="28"/>
-          <w:szCs w:val="28"/>
-        </w:rPr>
-        <w:t>Warehouse Wizard — Priority Build Specifications</w:t>
-      </w:r>
-    </w:p>
-    <w:p>
-      <w:pPr>
-        <w:pBdr>
-          <w:bottom w:val="single" w:sz="6" w:space="1" w:color="1A3C5E"/>
-        </w:pBdr>
-        <w:spacing w:before="120" w:after="120"/>
-      </w:pPr>
-    </w:p>
-    <w:p>
-      <w:pPr>
-        <w:spacing w:before="60" w:after="300"/>
-      </w:pPr>
-      <w:r>
-        <w:rPr>
-          <w:color w:val="999999"/>
-          <w:sz w:val="20"/>
-          <w:szCs w:val="20"/>
-        </w:rPr>
-        <w:t>Internal use only   |   May 2026</w:t>
-      </w:r>
-    </w:p>
-    <w:p>
-      <w:pPr>
-        <w:spacing w:before="60" w:after="60"/>
-      </w:pPr>
-      <w:r>
-        <w:t>This section provides specific technical guidance for closing the four remaining feature gaps identified in the competitive analysis. Each item references existing codebase patterns, database tables, and suggested implementation approaches.</w:t>
-      </w:r>
-    </w:p>
-    <w:p>
-      <w:pPr>
-        <w:spacing w:before="80" w:after="80"/>
-      </w:pPr>
-    </w:p>
-    <w:tbl>
-      <w:tblPr>
-        <w:tblW w:w="9360" w:type="dxa"/>
-        <w:tblBorders>
-          <w:top w:val="single" w:sz="4" w:space="0" w:color="auto"/>
-          <w:left w:val="single" w:sz="4" w:space="0" w:color="auto"/>
-          <w:bottom w:val="single" w:sz="4" w:space="0" w:color="auto"/>
-          <w:right w:val="single" w:sz="4" w:space="0" w:color="auto"/>
-          <w:insideH w:val="single" w:sz="4" w:space="0" w:color="auto"/>
-          <w:insideV w:val="single" w:sz="4" w:space="0" w:color="auto"/>
-        </w:tblBorders>
-        <w:tblCellMar>
-          <w:left w:w="10" w:type="dxa"/>
-          <w:right w:w="10" w:type="dxa"/>
-        </w:tblCellMar>
-        <w:tblLook w:val="04A0" w:firstRow="1" w:lastRow="0" w:firstColumn="1" w:lastColumn="0" w:noHBand="0" w:noVBand="1"/>
-      </w:tblPr>
-      <w:tblGrid>
-        <w:gridCol w:w="2760"/>
-        <w:gridCol w:w="1200"/>
-        <w:gridCol w:w="2000"/>
-        <w:gridCol w:w="3400"/>
-      </w:tblGrid>
-      <w:tr>
-        <w:tblPrEx>
-          <w:tblCellMar>
-            <w:top w:w="0" w:type="dxa"/>
-            <w:bottom w:w="0" w:type="dxa"/>
-          </w:tblCellMar>
-        </w:tblPrEx>
-        <w:tc>
-          <w:tcPr>
-            <w:tcW w:w="2760" w:type="dxa"/>
-            <w:tcBorders>
-              <w:top w:val="single" w:sz="1" w:space="0" w:color="CCCCCC"/>
-              <w:left w:val="single" w:sz="1" w:space="0" w:color="CCCCCC"/>
-              <w:bottom w:val="single" w:sz="1" w:space="0" w:color="CCCCCC"/>
-              <w:right w:val="single" w:sz="1" w:space="0" w:color="CCCCCC"/>
-            </w:tcBorders>
-            <w:shd w:val="clear" w:color="auto" w:fill="1A3C5E"/>
-            <w:tcMar>
-              <w:top w:w="100" w:type="dxa"/>
-              <w:left w:w="140" w:type="dxa"/>
-              <w:bottom w:w="100" w:type="dxa"/>
-              <w:right w:w="140" w:type="dxa"/>
-            </w:tcMar>
-            <w:vAlign w:val="center"/>
-          </w:tcPr>
-          <w:p>
-            <w:r>
-              <w:rPr>
-                <w:b/>
-                <w:bCs/>
-                <w:color w:val="FFFFFF"/>
-                <w:sz w:val="20"/>
-                <w:szCs w:val="20"/>
-              </w:rPr>
-              <w:t>Gap</w:t>
-            </w:r>
-          </w:p>
-        </w:tc>
-        <w:tc>
-          <w:tcPr>
-            <w:tcW w:w="1200" w:type="dxa"/>
-            <w:tcBorders>
-              <w:top w:val="single" w:sz="1" w:space="0" w:color="CCCCCC"/>
-              <w:left w:val="single" w:sz="1" w:space="0" w:color="CCCCCC"/>
-              <w:bottom w:val="single" w:sz="1" w:space="0" w:color="CCCCCC"/>
-              <w:right w:val="single" w:sz="1" w:space="0" w:color="CCCCCC"/>
-            </w:tcBorders>
-            <w:shd w:val="clear" w:color="auto" w:fill="1A3C5E"/>
-            <w:tcMar>
-              <w:top w:w="100" w:type="dxa"/>
-              <w:left w:w="140" w:type="dxa"/>
-              <w:bottom w:w="100" w:type="dxa"/>
-              <w:right w:w="140" w:type="dxa"/>
-            </w:tcMar>
-            <w:vAlign w:val="center"/>
-          </w:tcPr>
-          <w:p>
-            <w:r>
-              <w:rPr>
-                <w:b/>
-                <w:bCs/>
-                <w:color w:val="FFFFFF"/>
-                <w:sz w:val="20"/>
-                <w:szCs w:val="20"/>
-              </w:rPr>
-              <w:t>Priority</w:t>
-            </w:r>
-          </w:p>
-        </w:tc>
-        <w:tc>
-          <w:tcPr>
-            <w:tcW w:w="2000" w:type="dxa"/>
-            <w:tcBorders>
-              <w:top w:val="single" w:sz="1" w:space="0" w:color="CCCCCC"/>
-              <w:left w:val="single" w:sz="1" w:space="0" w:color="CCCCCC"/>
-              <w:bottom w:val="single" w:sz="1" w:space="0" w:color="CCCCCC"/>
-              <w:right w:val="single" w:sz="1" w:space="0" w:color="CCCCCC"/>
-            </w:tcBorders>
-            <w:shd w:val="clear" w:color="auto" w:fill="1A3C5E"/>
-            <w:tcMar>
-              <w:top w:w="100" w:type="dxa"/>
-              <w:left w:w="140" w:type="dxa"/>
-              <w:bottom w:w="100" w:type="dxa"/>
-              <w:right w:w="140" w:type="dxa"/>
-            </w:tcMar>
-            <w:vAlign w:val="center"/>
-          </w:tcPr>
-          <w:p>
-            <w:r>
-              <w:rPr>
-                <w:b/>
-                <w:bCs/>
-                <w:color w:val="FFFFFF"/>
-                <w:sz w:val="20"/>
-                <w:szCs w:val="20"/>
-              </w:rPr>
-              <w:t>Effort Estimate</w:t>
-            </w:r>
-          </w:p>
-        </w:tc>
-        <w:tc>
-          <w:tcPr>
-            <w:tcW w:w="3400" w:type="dxa"/>
-            <w:tcBorders>
-              <w:top w:val="single" w:sz="1" w:space="0" w:color="CCCCCC"/>
-              <w:left w:val="single" w:sz="1" w:space="0" w:color="CCCCCC"/>
-              <w:bottom w:val="single" w:sz="1" w:space="0" w:color="CCCCCC"/>
-              <w:right w:val="single" w:sz="1" w:space="0" w:color="CCCCCC"/>
-            </w:tcBorders>
-            <w:shd w:val="clear" w:color="auto" w:fill="1A3C5E"/>
-            <w:tcMar>
-              <w:top w:w="100" w:type="dxa"/>
-              <w:left w:w="140" w:type="dxa"/>
-              <w:bottom w:w="100" w:type="dxa"/>
-              <w:right w:w="140" w:type="dxa"/>
-            </w:tcMar>
-            <w:vAlign w:val="center"/>
-          </w:tcPr>
-          <w:p>
-            <w:r>
-              <w:rPr>
-                <w:b/>
-                <w:bCs/>
-                <w:color w:val="FFFFFF"/>
-                <w:sz w:val="20"/>
-                <w:szCs w:val="20"/>
-              </w:rPr>
-              <w:t>Codebase Entry Points</w:t>
-            </w:r>
-          </w:p>
-        </w:tc>
-      </w:tr>
-      <w:tr>
-        <w:tblPrEx>
-          <w:tblCellMar>
-            <w:top w:w="0" w:type="dxa"/>
-            <w:bottom w:w="0" w:type="dxa"/>
-          </w:tblCellMar>
-        </w:tblPrEx>
-        <w:tc>
-          <w:tcPr>
-            <w:tcW w:w="2760" w:type="dxa"/>
-            <w:tcBorders>
-              <w:top w:val="single" w:sz="1" w:space="0" w:color="CCCCCC"/>
-              <w:left w:val="single" w:sz="1" w:space="0" w:color="CCCCCC"/>
-              <w:bottom w:val="single" w:sz="1" w:space="0" w:color="CCCCCC"/>
-              <w:right w:val="single" w:sz="1" w:space="0" w:color="CCCCCC"/>
-            </w:tcBorders>
-            <w:shd w:val="clear" w:color="auto" w:fill="FFFFFF"/>
-            <w:tcMar>
-              <w:top w:w="100" w:type="dxa"/>
-              <w:left w:w="140" w:type="dxa"/>
-              <w:bottom w:w="100" w:type="dxa"/>
-              <w:right w:w="140" w:type="dxa"/>
-            </w:tcMar>
-            <w:vAlign w:val="center"/>
-          </w:tcPr>
-          <w:p>
-            <w:r>
-              <w:rPr>
-                <w:color w:val="1A1A1A"/>
-                <w:sz w:val="20"/>
-                <w:szCs w:val="20"/>
-              </w:rPr>
-              <w:t>Cross-location auto-assignment</w:t>
-            </w:r>
-          </w:p>
-        </w:tc>
-        <w:tc>
-          <w:tcPr>
-            <w:tcW w:w="1200" w:type="dxa"/>
-            <w:tcBorders>
-              <w:top w:val="single" w:sz="1" w:space="0" w:color="CCCCCC"/>
-              <w:left w:val="single" w:sz="1" w:space="0" w:color="CCCCCC"/>
-              <w:bottom w:val="single" w:sz="1" w:space="0" w:color="CCCCCC"/>
-              <w:right w:val="single" w:sz="1" w:space="0" w:color="CCCCCC"/>
-            </w:tcBorders>
-            <w:shd w:val="clear" w:color="auto" w:fill="FFFFFF"/>
-            <w:tcMar>
-              <w:top w:w="100" w:type="dxa"/>
-              <w:left w:w="140" w:type="dxa"/>
-              <w:bottom w:w="100" w:type="dxa"/>
-              <w:right w:w="140" w:type="dxa"/>
-            </w:tcMar>
-            <w:vAlign w:val="center"/>
-          </w:tcPr>
-          <w:p>
-            <w:r>
-              <w:rPr>
-                <w:color w:val="1A1A1A"/>
-                <w:sz w:val="20"/>
-                <w:szCs w:val="20"/>
-              </w:rPr>
-              <w:t>LOW–MED</w:t>
-            </w:r>
-          </w:p>
-        </w:tc>
-        <w:tc>
-          <w:tcPr>
-            <w:tcW w:w="2000" w:type="dxa"/>
-            <w:tcBorders>
-              <w:top w:val="single" w:sz="1" w:space="0" w:color="CCCCCC"/>
-              <w:left w:val="single" w:sz="1" w:space="0" w:color="CCCCCC"/>
-              <w:bottom w:val="single" w:sz="1" w:space="0" w:color="CCCCCC"/>
-              <w:right w:val="single" w:sz="1" w:space="0" w:color="CCCCCC"/>
-            </w:tcBorders>
-            <w:shd w:val="clear" w:color="auto" w:fill="FFFFFF"/>
-            <w:tcMar>
-              <w:top w:w="100" w:type="dxa"/>
-              <w:left w:w="140" w:type="dxa"/>
-              <w:bottom w:w="100" w:type="dxa"/>
-              <w:right w:w="140" w:type="dxa"/>
-            </w:tcMar>
-            <w:vAlign w:val="center"/>
-          </w:tcPr>
-          <w:p>
-            <w:r>
-              <w:rPr>
-                <w:color w:val="1A1A1A"/>
-                <w:sz w:val="20"/>
-                <w:szCs w:val="20"/>
-              </w:rPr>
-              <w:t>Medium (1–2 sprints)</w:t>
-            </w:r>
-          </w:p>
-        </w:tc>
-        <w:tc>
-          <w:tcPr>
-            <w:tcW w:w="3400" w:type="dxa"/>
-            <w:tcBorders>
-              <w:top w:val="single" w:sz="1" w:space="0" w:color="CCCCCC"/>
-              <w:left w:val="single" w:sz="1" w:space="0" w:color="CCCCCC"/>
-              <w:bottom w:val="single" w:sz="1" w:space="0" w:color="CCCCCC"/>
-              <w:right w:val="single" w:sz="1" w:space="0" w:color="CCCCCC"/>
-            </w:tcBorders>
-            <w:shd w:val="clear" w:color="auto" w:fill="FFFFFF"/>
-            <w:tcMar>
-              <w:top w:w="100" w:type="dxa"/>
-              <w:left w:w="140" w:type="dxa"/>
-              <w:bottom w:w="100" w:type="dxa"/>
-              <w:right w:w="140" w:type="dxa"/>
-            </w:tcMar>
-            <w:vAlign w:val="center"/>
-          </w:tcPr>
-          <w:p>
-            <w:proofErr w:type="spellStart"/>
-            <w:r>
-              <w:rPr>
-                <w:color w:val="1A1A1A"/>
-                <w:sz w:val="20"/>
-                <w:szCs w:val="20"/>
-              </w:rPr>
-              <w:t>createPickListFlow</w:t>
-            </w:r>
-            <w:proofErr w:type="spellEnd"/>
-            <w:r>
-              <w:rPr>
-                <w:color w:val="1A1A1A"/>
-                <w:sz w:val="20"/>
-                <w:szCs w:val="20"/>
-              </w:rPr>
-              <w:t xml:space="preserve">, </w:t>
-            </w:r>
-            <w:proofErr w:type="spellStart"/>
-            <w:r>
-              <w:rPr>
-                <w:color w:val="1A1A1A"/>
-                <w:sz w:val="20"/>
-                <w:szCs w:val="20"/>
-              </w:rPr>
-              <w:t>transferSchema</w:t>
-            </w:r>
-            <w:proofErr w:type="spellEnd"/>
-            <w:r>
-              <w:rPr>
-                <w:color w:val="1A1A1A"/>
-                <w:sz w:val="20"/>
-                <w:szCs w:val="20"/>
-              </w:rPr>
-              <w:t xml:space="preserve">, </w:t>
-            </w:r>
-            <w:proofErr w:type="spellStart"/>
-            <w:r>
-              <w:rPr>
-                <w:color w:val="1A1A1A"/>
-                <w:sz w:val="20"/>
-                <w:szCs w:val="20"/>
-              </w:rPr>
-              <w:t>fetchOptions</w:t>
-            </w:r>
-            <w:proofErr w:type="spellEnd"/>
-          </w:p>
-        </w:tc>
-      </w:tr>
-      <w:tr>
-        <w:tblPrEx>
-          <w:tblCellMar>
-            <w:top w:w="0" w:type="dxa"/>
-            <w:bottom w:w="0" w:type="dxa"/>
-          </w:tblCellMar>
-        </w:tblPrEx>
-        <w:tc>
-          <w:tcPr>
-            <w:tcW w:w="2760" w:type="dxa"/>
-            <w:tcBorders>
-              <w:top w:val="single" w:sz="1" w:space="0" w:color="CCCCCC"/>
-              <w:left w:val="single" w:sz="1" w:space="0" w:color="CCCCCC"/>
-              <w:bottom w:val="single" w:sz="1" w:space="0" w:color="CCCCCC"/>
-              <w:right w:val="single" w:sz="1" w:space="0" w:color="CCCCCC"/>
-            </w:tcBorders>
-            <w:shd w:val="clear" w:color="auto" w:fill="F0F5FA"/>
-            <w:tcMar>
-              <w:top w:w="100" w:type="dxa"/>
-              <w:left w:w="140" w:type="dxa"/>
-              <w:bottom w:w="100" w:type="dxa"/>
-              <w:right w:w="140" w:type="dxa"/>
-            </w:tcMar>
-            <w:vAlign w:val="center"/>
-          </w:tcPr>
-          <w:p>
-            <w:r>
-              <w:rPr>
-                <w:color w:val="1A1A1A"/>
-                <w:sz w:val="20"/>
-                <w:szCs w:val="20"/>
-              </w:rPr>
-              <w:t>Smart Count (no-freeze cycle count)</w:t>
-            </w:r>
-          </w:p>
-        </w:tc>
-        <w:tc>
-          <w:tcPr>
-            <w:tcW w:w="1200" w:type="dxa"/>
-            <w:tcBorders>
-              <w:top w:val="single" w:sz="1" w:space="0" w:color="CCCCCC"/>
-              <w:left w:val="single" w:sz="1" w:space="0" w:color="CCCCCC"/>
-              <w:bottom w:val="single" w:sz="1" w:space="0" w:color="CCCCCC"/>
-              <w:right w:val="single" w:sz="1" w:space="0" w:color="CCCCCC"/>
-            </w:tcBorders>
-            <w:shd w:val="clear" w:color="auto" w:fill="F0F5FA"/>
-            <w:tcMar>
-              <w:top w:w="100" w:type="dxa"/>
-              <w:left w:w="140" w:type="dxa"/>
-              <w:bottom w:w="100" w:type="dxa"/>
-              <w:right w:w="140" w:type="dxa"/>
-            </w:tcMar>
-            <w:vAlign w:val="center"/>
-          </w:tcPr>
-          <w:p>
-            <w:r>
-              <w:rPr>
-                <w:color w:val="1A1A1A"/>
-                <w:sz w:val="20"/>
-                <w:szCs w:val="20"/>
-              </w:rPr>
-              <w:t>LOW</w:t>
-            </w:r>
-          </w:p>
-        </w:tc>
-        <w:tc>
-          <w:tcPr>
-            <w:tcW w:w="2000" w:type="dxa"/>
-            <w:tcBorders>
-              <w:top w:val="single" w:sz="1" w:space="0" w:color="CCCCCC"/>
-              <w:left w:val="single" w:sz="1" w:space="0" w:color="CCCCCC"/>
-              <w:bottom w:val="single" w:sz="1" w:space="0" w:color="CCCCCC"/>
-              <w:right w:val="single" w:sz="1" w:space="0" w:color="CCCCCC"/>
-            </w:tcBorders>
-            <w:shd w:val="clear" w:color="auto" w:fill="F0F5FA"/>
-            <w:tcMar>
-              <w:top w:w="100" w:type="dxa"/>
-              <w:left w:w="140" w:type="dxa"/>
-              <w:bottom w:w="100" w:type="dxa"/>
-              <w:right w:w="140" w:type="dxa"/>
-            </w:tcMar>
-            <w:vAlign w:val="center"/>
-          </w:tcPr>
-          <w:p>
-            <w:r>
-              <w:rPr>
-                <w:color w:val="1A1A1A"/>
-                <w:sz w:val="20"/>
-                <w:szCs w:val="20"/>
-              </w:rPr>
-              <w:t>Medium (1 sprint)</w:t>
-            </w:r>
-          </w:p>
-        </w:tc>
-        <w:tc>
-          <w:tcPr>
-            <w:tcW w:w="3400" w:type="dxa"/>
-            <w:tcBorders>
-              <w:top w:val="single" w:sz="1" w:space="0" w:color="CCCCCC"/>
-              <w:left w:val="single" w:sz="1" w:space="0" w:color="CCCCCC"/>
-              <w:bottom w:val="single" w:sz="1" w:space="0" w:color="CCCCCC"/>
-              <w:right w:val="single" w:sz="1" w:space="0" w:color="CCCCCC"/>
-            </w:tcBorders>
-            <w:shd w:val="clear" w:color="auto" w:fill="F0F5FA"/>
-            <w:tcMar>
-              <w:top w:w="100" w:type="dxa"/>
-              <w:left w:w="140" w:type="dxa"/>
-              <w:bottom w:w="100" w:type="dxa"/>
-              <w:right w:w="140" w:type="dxa"/>
-            </w:tcMar>
-            <w:vAlign w:val="center"/>
-          </w:tcPr>
-          <w:p>
-            <w:proofErr w:type="spellStart"/>
-            <w:r>
-              <w:rPr>
-                <w:color w:val="1A1A1A"/>
-                <w:sz w:val="20"/>
-                <w:szCs w:val="20"/>
-              </w:rPr>
-              <w:t>createCycleCountFlow</w:t>
-            </w:r>
-            <w:proofErr w:type="spellEnd"/>
-            <w:r>
-              <w:rPr>
-                <w:color w:val="1A1A1A"/>
-                <w:sz w:val="20"/>
-                <w:szCs w:val="20"/>
-              </w:rPr>
-              <w:t xml:space="preserve">, </w:t>
-            </w:r>
-            <w:proofErr w:type="spellStart"/>
-            <w:r>
-              <w:rPr>
-                <w:color w:val="1A1A1A"/>
-                <w:sz w:val="20"/>
-                <w:szCs w:val="20"/>
-              </w:rPr>
-              <w:t>submitCycleCountLine</w:t>
-            </w:r>
-            <w:proofErr w:type="spellEnd"/>
-            <w:r>
-              <w:rPr>
-                <w:color w:val="1A1A1A"/>
-                <w:sz w:val="20"/>
-                <w:szCs w:val="20"/>
-              </w:rPr>
-              <w:t xml:space="preserve">, </w:t>
-            </w:r>
-            <w:proofErr w:type="spellStart"/>
-            <w:r>
-              <w:rPr>
-                <w:color w:val="1A1A1A"/>
-                <w:sz w:val="20"/>
-                <w:szCs w:val="20"/>
-              </w:rPr>
-              <w:t>listCycleCounts</w:t>
-            </w:r>
-            <w:proofErr w:type="spellEnd"/>
-          </w:p>
-        </w:tc>
-      </w:tr>
-      <w:tr>
-        <w:tblPrEx>
-          <w:tblCellMar>
-            <w:top w:w="0" w:type="dxa"/>
-            <w:bottom w:w="0" w:type="dxa"/>
-          </w:tblCellMar>
-        </w:tblPrEx>
-        <w:tc>
-          <w:tcPr>
-            <w:tcW w:w="2760" w:type="dxa"/>
-            <w:tcBorders>
-              <w:top w:val="single" w:sz="1" w:space="0" w:color="CCCCCC"/>
-              <w:left w:val="single" w:sz="1" w:space="0" w:color="CCCCCC"/>
-              <w:bottom w:val="single" w:sz="1" w:space="0" w:color="CCCCCC"/>
-              <w:right w:val="single" w:sz="1" w:space="0" w:color="CCCCCC"/>
-            </w:tcBorders>
-            <w:shd w:val="clear" w:color="auto" w:fill="FFFFFF"/>
-            <w:tcMar>
-              <w:top w:w="100" w:type="dxa"/>
-              <w:left w:w="140" w:type="dxa"/>
-              <w:bottom w:w="100" w:type="dxa"/>
-              <w:right w:w="140" w:type="dxa"/>
-            </w:tcMar>
-            <w:vAlign w:val="center"/>
-          </w:tcPr>
-          <w:p>
-            <w:r>
-              <w:rPr>
-                <w:color w:val="1A1A1A"/>
-                <w:sz w:val="20"/>
-                <w:szCs w:val="20"/>
-              </w:rPr>
-              <w:t>Return authorization receiving</w:t>
-            </w:r>
-          </w:p>
-        </w:tc>
-        <w:tc>
-          <w:tcPr>
-            <w:tcW w:w="1200" w:type="dxa"/>
-            <w:tcBorders>
-              <w:top w:val="single" w:sz="1" w:space="0" w:color="CCCCCC"/>
-              <w:left w:val="single" w:sz="1" w:space="0" w:color="CCCCCC"/>
-              <w:bottom w:val="single" w:sz="1" w:space="0" w:color="CCCCCC"/>
-              <w:right w:val="single" w:sz="1" w:space="0" w:color="CCCCCC"/>
-            </w:tcBorders>
-            <w:shd w:val="clear" w:color="auto" w:fill="FFFFFF"/>
-            <w:tcMar>
-              <w:top w:w="100" w:type="dxa"/>
-              <w:left w:w="140" w:type="dxa"/>
-              <w:bottom w:w="100" w:type="dxa"/>
-              <w:right w:w="140" w:type="dxa"/>
-            </w:tcMar>
-            <w:vAlign w:val="center"/>
-          </w:tcPr>
-          <w:p>
-            <w:r>
-              <w:rPr>
-                <w:color w:val="1A1A1A"/>
-                <w:sz w:val="20"/>
-                <w:szCs w:val="20"/>
-              </w:rPr>
-              <w:t>LOW</w:t>
-            </w:r>
-          </w:p>
-        </w:tc>
-        <w:tc>
-          <w:tcPr>
-            <w:tcW w:w="2000" w:type="dxa"/>
-            <w:tcBorders>
-              <w:top w:val="single" w:sz="1" w:space="0" w:color="CCCCCC"/>
-              <w:left w:val="single" w:sz="1" w:space="0" w:color="CCCCCC"/>
-              <w:bottom w:val="single" w:sz="1" w:space="0" w:color="CCCCCC"/>
-              <w:right w:val="single" w:sz="1" w:space="0" w:color="CCCCCC"/>
-            </w:tcBorders>
-            <w:shd w:val="clear" w:color="auto" w:fill="FFFFFF"/>
-            <w:tcMar>
-              <w:top w:w="100" w:type="dxa"/>
-              <w:left w:w="140" w:type="dxa"/>
-              <w:bottom w:w="100" w:type="dxa"/>
-              <w:right w:w="140" w:type="dxa"/>
-            </w:tcMar>
-            <w:vAlign w:val="center"/>
-          </w:tcPr>
-          <w:p>
-            <w:r>
-              <w:rPr>
-                <w:color w:val="1A1A1A"/>
-                <w:sz w:val="20"/>
-                <w:szCs w:val="20"/>
-              </w:rPr>
-              <w:t>Small–Medium (1 sprint)</w:t>
-            </w:r>
-          </w:p>
-        </w:tc>
-        <w:tc>
-          <w:tcPr>
-            <w:tcW w:w="3400" w:type="dxa"/>
-            <w:tcBorders>
-              <w:top w:val="single" w:sz="1" w:space="0" w:color="CCCCCC"/>
-              <w:left w:val="single" w:sz="1" w:space="0" w:color="CCCCCC"/>
-              <w:bottom w:val="single" w:sz="1" w:space="0" w:color="CCCCCC"/>
-              <w:right w:val="single" w:sz="1" w:space="0" w:color="CCCCCC"/>
-            </w:tcBorders>
-            <w:shd w:val="clear" w:color="auto" w:fill="FFFFFF"/>
-            <w:tcMar>
-              <w:top w:w="100" w:type="dxa"/>
-              <w:left w:w="140" w:type="dxa"/>
-              <w:bottom w:w="100" w:type="dxa"/>
-              <w:right w:w="140" w:type="dxa"/>
-            </w:tcMar>
-            <w:vAlign w:val="center"/>
-          </w:tcPr>
-          <w:p>
-            <w:proofErr w:type="spellStart"/>
-            <w:r>
-              <w:rPr>
-                <w:color w:val="1A1A1A"/>
-                <w:sz w:val="20"/>
-                <w:szCs w:val="20"/>
-              </w:rPr>
-              <w:t>createReceiptFlow</w:t>
-            </w:r>
-            <w:proofErr w:type="spellEnd"/>
-            <w:r>
-              <w:rPr>
-                <w:color w:val="1A1A1A"/>
-                <w:sz w:val="20"/>
-                <w:szCs w:val="20"/>
-              </w:rPr>
-              <w:t xml:space="preserve">, </w:t>
-            </w:r>
-            <w:proofErr w:type="spellStart"/>
-            <w:r>
-              <w:rPr>
-                <w:color w:val="1A1A1A"/>
-                <w:sz w:val="20"/>
-                <w:szCs w:val="20"/>
-              </w:rPr>
-              <w:t>receivingSchema</w:t>
-            </w:r>
-            <w:proofErr w:type="spellEnd"/>
-            <w:r>
-              <w:rPr>
-                <w:color w:val="1A1A1A"/>
-                <w:sz w:val="20"/>
-                <w:szCs w:val="20"/>
-              </w:rPr>
-              <w:t>, RESOURCE_DEFINITIONS</w:t>
-            </w:r>
-          </w:p>
-        </w:tc>
-      </w:tr>
-      <w:tr>
-        <w:tblPrEx>
-          <w:tblCellMar>
-            <w:top w:w="0" w:type="dxa"/>
-            <w:bottom w:w="0" w:type="dxa"/>
-          </w:tblCellMar>
-        </w:tblPrEx>
-        <w:tc>
-          <w:tcPr>
-            <w:tcW w:w="2760" w:type="dxa"/>
-            <w:tcBorders>
-              <w:top w:val="single" w:sz="1" w:space="0" w:color="CCCCCC"/>
-              <w:left w:val="single" w:sz="1" w:space="0" w:color="CCCCCC"/>
-              <w:bottom w:val="single" w:sz="1" w:space="0" w:color="CCCCCC"/>
-              <w:right w:val="single" w:sz="1" w:space="0" w:color="CCCCCC"/>
-            </w:tcBorders>
-            <w:shd w:val="clear" w:color="auto" w:fill="F0F5FA"/>
-            <w:tcMar>
-              <w:top w:w="100" w:type="dxa"/>
-              <w:left w:w="140" w:type="dxa"/>
-              <w:bottom w:w="100" w:type="dxa"/>
-              <w:right w:w="140" w:type="dxa"/>
-            </w:tcMar>
-            <w:vAlign w:val="center"/>
-          </w:tcPr>
-          <w:p>
-            <w:r>
-              <w:rPr>
-                <w:color w:val="1A1A1A"/>
-                <w:sz w:val="20"/>
-                <w:szCs w:val="20"/>
-              </w:rPr>
-              <w:t>Native mobile app</w:t>
-            </w:r>
-          </w:p>
-        </w:tc>
-        <w:tc>
-          <w:tcPr>
-            <w:tcW w:w="1200" w:type="dxa"/>
-            <w:tcBorders>
-              <w:top w:val="single" w:sz="1" w:space="0" w:color="CCCCCC"/>
-              <w:left w:val="single" w:sz="1" w:space="0" w:color="CCCCCC"/>
-              <w:bottom w:val="single" w:sz="1" w:space="0" w:color="CCCCCC"/>
-              <w:right w:val="single" w:sz="1" w:space="0" w:color="CCCCCC"/>
-            </w:tcBorders>
-            <w:shd w:val="clear" w:color="auto" w:fill="F0F5FA"/>
-            <w:tcMar>
-              <w:top w:w="100" w:type="dxa"/>
-              <w:left w:w="140" w:type="dxa"/>
-              <w:bottom w:w="100" w:type="dxa"/>
-              <w:right w:w="140" w:type="dxa"/>
-            </w:tcMar>
-            <w:vAlign w:val="center"/>
-          </w:tcPr>
-          <w:p>
-            <w:r>
-              <w:rPr>
-                <w:color w:val="1A1A1A"/>
-                <w:sz w:val="20"/>
-                <w:szCs w:val="20"/>
-              </w:rPr>
-              <w:t>LOW</w:t>
-            </w:r>
-          </w:p>
-        </w:tc>
-        <w:tc>
-          <w:tcPr>
-            <w:tcW w:w="2000" w:type="dxa"/>
-            <w:tcBorders>
-              <w:top w:val="single" w:sz="1" w:space="0" w:color="CCCCCC"/>
-              <w:left w:val="single" w:sz="1" w:space="0" w:color="CCCCCC"/>
-              <w:bottom w:val="single" w:sz="1" w:space="0" w:color="CCCCCC"/>
-              <w:right w:val="single" w:sz="1" w:space="0" w:color="CCCCCC"/>
-            </w:tcBorders>
-            <w:shd w:val="clear" w:color="auto" w:fill="F0F5FA"/>
-            <w:tcMar>
-              <w:top w:w="100" w:type="dxa"/>
-              <w:left w:w="140" w:type="dxa"/>
-              <w:bottom w:w="100" w:type="dxa"/>
-              <w:right w:w="140" w:type="dxa"/>
-            </w:tcMar>
-            <w:vAlign w:val="center"/>
-          </w:tcPr>
-          <w:p>
-            <w:r>
-              <w:rPr>
-                <w:color w:val="1A1A1A"/>
-                <w:sz w:val="20"/>
-                <w:szCs w:val="20"/>
-              </w:rPr>
-              <w:t>Large (ongoing)</w:t>
-            </w:r>
-          </w:p>
-        </w:tc>
-        <w:tc>
-          <w:tcPr>
-            <w:tcW w:w="3400" w:type="dxa"/>
-            <w:tcBorders>
-              <w:top w:val="single" w:sz="1" w:space="0" w:color="CCCCCC"/>
-              <w:left w:val="single" w:sz="1" w:space="0" w:color="CCCCCC"/>
-              <w:bottom w:val="single" w:sz="1" w:space="0" w:color="CCCCCC"/>
-              <w:right w:val="single" w:sz="1" w:space="0" w:color="CCCCCC"/>
-            </w:tcBorders>
-            <w:shd w:val="clear" w:color="auto" w:fill="F0F5FA"/>
-            <w:tcMar>
-              <w:top w:w="100" w:type="dxa"/>
-              <w:left w:w="140" w:type="dxa"/>
-              <w:bottom w:w="100" w:type="dxa"/>
-              <w:right w:w="140" w:type="dxa"/>
-            </w:tcMar>
-            <w:vAlign w:val="center"/>
-          </w:tcPr>
-          <w:p>
-            <w:r>
-              <w:rPr>
-                <w:color w:val="1A1A1A"/>
-                <w:sz w:val="20"/>
-                <w:szCs w:val="20"/>
-              </w:rPr>
-              <w:t>Existing responsive web shell + barcode-scan-</w:t>
-            </w:r>
-            <w:proofErr w:type="spellStart"/>
-            <w:r>
-              <w:rPr>
-                <w:color w:val="1A1A1A"/>
-                <w:sz w:val="20"/>
-                <w:szCs w:val="20"/>
-              </w:rPr>
-              <w:t>button.tsx</w:t>
-            </w:r>
-            <w:proofErr w:type="spellEnd"/>
-          </w:p>
-        </w:tc>
-      </w:tr>
-    </w:tbl>
-    <w:p>
-      <w:pPr>
-        <w:spacing w:before="80" w:after="80"/>
-      </w:pPr>
-    </w:p>
-    <w:p>
-      <w:pPr>
-        <w:spacing w:before="80" w:after="80"/>
-      </w:pPr>
-    </w:p>
-    <w:p>
-      <w:pPr>
-        <w:spacing w:before="240" w:after="80"/>
-      </w:pPr>
-      <w:r>
-        <w:rPr>
-          <w:b/>
-          <w:bCs/>
-          <w:color w:val="8B1A1A"/>
-          <w:sz w:val="25"/>
-          <w:szCs w:val="25"/>
-        </w:rPr>
-        <w:t>Gap 1: Cross-Location Auto-Assignment</w:t>
-      </w:r>
-    </w:p>
-    <w:p>
-      <w:pPr>
-        <w:spacing w:before="160" w:after="60"/>
-      </w:pPr>
-      <w:r>
-        <w:rPr>
-          <w:b/>
-          <w:bCs/>
-          <w:color w:val="1A3C5E"/>
-        </w:rPr>
-        <w:t>What it does</w:t>
-      </w:r>
-    </w:p>
-    <w:p>
-      <w:pPr>
-        <w:spacing w:before="60" w:after="60"/>
-      </w:pPr>
-      <w:r>
-        <w:t>When a pick list is created, the system automatically selects the optimal warehouse to fulfil from — based on inventory availability, proximity rules, or a priority order defined per client or product — rather than requiring the operator to choose the warehouse manually.</w:t>
-      </w:r>
-    </w:p>
-    <w:p>
-      <w:pPr>
-        <w:spacing w:before="160" w:after="60"/>
-      </w:pPr>
-      <w:r>
-        <w:rPr>
-          <w:b/>
-          <w:bCs/>
-          <w:color w:val="1A3C5E"/>
-        </w:rPr>
-        <w:t>Current state</w:t>
-      </w:r>
-    </w:p>
-    <w:p>
-      <w:pPr>
-        <w:spacing w:before="60" w:after="60"/>
-      </w:pPr>
-      <w:proofErr w:type="spellStart"/>
-      <w:r>
-        <w:t>createPickListFlow</w:t>
-      </w:r>
-      <w:proofErr w:type="spellEnd"/>
-      <w:r>
-        <w:t xml:space="preserve"> (</w:t>
-      </w:r>
-      <w:proofErr w:type="spellStart"/>
-      <w:r>
-        <w:t>wms-core.ts</w:t>
-      </w:r>
-      <w:proofErr w:type="spellEnd"/>
-      <w:r>
-        <w:t xml:space="preserve"> ~line 1475) takes a </w:t>
-      </w:r>
-      <w:proofErr w:type="spellStart"/>
-      <w:r>
-        <w:t>warehouse_id</w:t>
-      </w:r>
-      <w:proofErr w:type="spellEnd"/>
-      <w:r>
-        <w:t xml:space="preserve"> as required input. The operator selects the warehouse explicitly in the pick list creation form. </w:t>
-      </w:r>
-      <w:proofErr w:type="spellStart"/>
-      <w:r>
-        <w:t>selectPickCandidates</w:t>
-      </w:r>
-      <w:proofErr w:type="spellEnd"/>
-      <w:r>
-        <w:t xml:space="preserve"> then resolves inventory within that warehouse.</w:t>
-      </w:r>
-    </w:p>
-    <w:p>
-      <w:pPr>
-        <w:spacing w:before="160" w:after="60"/>
-      </w:pPr>
-      <w:r>
-        <w:rPr>
-          <w:b/>
-          <w:bCs/>
-          <w:color w:val="1A3C5E"/>
-        </w:rPr>
-        <w:t>Recommended approach</w:t>
-      </w:r>
-    </w:p>
-    <w:p>
-      <w:pPr>
-        <w:pStyle w:val="ListParagraph"/>
-        <w:numPr>
-          <w:ilvl w:val="0"/>
-          <w:numId w:val="2"/>
-        </w:numPr>
-        <w:spacing w:before="40" w:after="40"/>
-      </w:pPr>
-      <w:r>
-        <w:t xml:space="preserve">Add an </w:t>
-      </w:r>
-      <w:proofErr w:type="spellStart"/>
-      <w:r>
-        <w:t>auto_assign_warehouse</w:t>
-      </w:r>
-      <w:proofErr w:type="spellEnd"/>
-      <w:r>
-        <w:t xml:space="preserve"> </w:t>
-      </w:r>
-      <w:proofErr w:type="spellStart"/>
-      <w:r>
-        <w:t>boolean</w:t>
-      </w:r>
-      <w:proofErr w:type="spellEnd"/>
-      <w:r>
-        <w:t xml:space="preserve"> to </w:t>
-      </w:r>
-      <w:proofErr w:type="spellStart"/>
-      <w:r>
-        <w:t>pickListSchema</w:t>
-      </w:r>
-      <w:proofErr w:type="spellEnd"/>
-      <w:r>
-        <w:t xml:space="preserve"> (default false). When true, omit </w:t>
-      </w:r>
-      <w:proofErr w:type="spellStart"/>
-      <w:r>
-        <w:t>warehouse_id</w:t>
-      </w:r>
-      <w:proofErr w:type="spellEnd"/>
-      <w:r>
-        <w:t xml:space="preserve"> from required fields.</w:t>
-      </w:r>
-    </w:p>
-    <w:p>
-      <w:pPr>
-        <w:pStyle w:val="ListParagraph"/>
-        <w:numPr>
-          <w:ilvl w:val="0"/>
-          <w:numId w:val="2"/>
-        </w:numPr>
-        <w:spacing w:before="40" w:after="40"/>
-      </w:pPr>
-      <w:r>
-        <w:t xml:space="preserve">Create a new RPC or TS function </w:t>
-      </w:r>
-      <w:proofErr w:type="spellStart"/>
-      <w:r>
-        <w:t>resolveOptimalWarehouse</w:t>
-      </w:r>
-      <w:proofErr w:type="spellEnd"/>
-      <w:r>
-        <w:t>(</w:t>
-      </w:r>
-      <w:proofErr w:type="spellStart"/>
-      <w:r>
-        <w:t>productLines</w:t>
-      </w:r>
-      <w:proofErr w:type="spellEnd"/>
-      <w:r>
-        <w:t xml:space="preserve">, </w:t>
-      </w:r>
-      <w:proofErr w:type="spellStart"/>
-      <w:r>
-        <w:t>clientId</w:t>
-      </w:r>
-      <w:proofErr w:type="spellEnd"/>
-      <w:r>
-        <w:t xml:space="preserve">) that queries </w:t>
-      </w:r>
-      <w:proofErr w:type="spellStart"/>
-      <w:r>
-        <w:t>inventory_balances</w:t>
-      </w:r>
-      <w:proofErr w:type="spellEnd"/>
-      <w:r>
-        <w:t xml:space="preserve"> grouped by </w:t>
-      </w:r>
-      <w:proofErr w:type="spellStart"/>
-      <w:r>
-        <w:t>warehouse_id</w:t>
-      </w:r>
-      <w:proofErr w:type="spellEnd"/>
-      <w:r>
-        <w:t xml:space="preserve">, applies a client-level </w:t>
-      </w:r>
-      <w:proofErr w:type="spellStart"/>
-      <w:r>
-        <w:t>priority_warehouse_id</w:t>
-      </w:r>
-      <w:proofErr w:type="spellEnd"/>
-      <w:r>
-        <w:t xml:space="preserve"> from the clients table (add this column), and falls back to highest available quantity.</w:t>
-      </w:r>
-    </w:p>
-    <w:p>
-      <w:pPr>
-        <w:pStyle w:val="ListParagraph"/>
-        <w:numPr>
-          <w:ilvl w:val="0"/>
-          <w:numId w:val="2"/>
-        </w:numPr>
-        <w:spacing w:before="40" w:after="40"/>
-      </w:pPr>
-      <w:r>
-        <w:t xml:space="preserve">Insert this resolver before the order </w:t>
-      </w:r>
-      <w:proofErr w:type="spellStart"/>
-      <w:r>
-        <w:t>upsert</w:t>
-      </w:r>
-      <w:proofErr w:type="spellEnd"/>
-      <w:r>
-        <w:t xml:space="preserve"> in </w:t>
-      </w:r>
-      <w:proofErr w:type="spellStart"/>
-      <w:r>
-        <w:t>createPickListFlow</w:t>
-      </w:r>
-      <w:proofErr w:type="spellEnd"/>
-      <w:r>
-        <w:t xml:space="preserve"> when </w:t>
-      </w:r>
-      <w:proofErr w:type="spellStart"/>
-      <w:r>
-        <w:t>warehouse_id</w:t>
-      </w:r>
-      <w:proofErr w:type="spellEnd"/>
-      <w:r>
-        <w:t xml:space="preserve"> is absent.</w:t>
-      </w:r>
-    </w:p>
-    <w:p>
-      <w:pPr>
-        <w:pStyle w:val="ListParagraph"/>
-        <w:numPr>
-          <w:ilvl w:val="0"/>
-          <w:numId w:val="2"/>
-        </w:numPr>
-        <w:spacing w:before="40" w:after="40"/>
-      </w:pPr>
-      <w:r>
-        <w:t>Expose in the Create Pick List form as a "Best available warehouse" toggle alongside the manual warehouse selector.</w:t>
-      </w:r>
-    </w:p>
-    <w:p>
-      <w:pPr>
-        <w:pStyle w:val="ListParagraph"/>
-        <w:numPr>
-          <w:ilvl w:val="0"/>
-          <w:numId w:val="2"/>
-        </w:numPr>
-        <w:spacing w:before="40" w:after="40"/>
-      </w:pPr>
-      <w:r>
-        <w:lastRenderedPageBreak/>
-        <w:t xml:space="preserve">For multi-DC: extend warehouses table with a </w:t>
-      </w:r>
-      <w:proofErr w:type="spellStart"/>
-      <w:r>
-        <w:t>fulfilment_priority</w:t>
-      </w:r>
-      <w:proofErr w:type="spellEnd"/>
-      <w:r>
-        <w:t xml:space="preserve"> integer and filter </w:t>
-      </w:r>
-      <w:proofErr w:type="spellStart"/>
-      <w:r>
-        <w:t>fetchOptions</w:t>
-      </w:r>
-      <w:proofErr w:type="spellEnd"/>
-      <w:r>
-        <w:t xml:space="preserve"> to respect it.</w:t>
-      </w:r>
-    </w:p>
-    <w:p>
-      <w:pPr>
-        <w:spacing w:before="160" w:after="60"/>
-      </w:pPr>
-      <w:r>
-        <w:rPr>
-          <w:b/>
-          <w:bCs/>
-          <w:color w:val="1A3C5E"/>
-        </w:rPr>
-        <w:t>Database changes</w:t>
-      </w:r>
-    </w:p>
-    <w:p>
-      <w:pPr>
-        <w:pStyle w:val="ListParagraph"/>
-        <w:numPr>
-          <w:ilvl w:val="0"/>
-          <w:numId w:val="2"/>
-        </w:numPr>
-        <w:spacing w:before="40" w:after="40"/>
-      </w:pPr>
-      <w:r>
-        <w:t xml:space="preserve">clients </w:t>
-      </w:r>
-      <w:proofErr w:type="gramStart"/>
-      <w:r>
-        <w:t>table:</w:t>
-      </w:r>
-      <w:proofErr w:type="gramEnd"/>
-      <w:r>
-        <w:t xml:space="preserve"> add </w:t>
-      </w:r>
-      <w:proofErr w:type="spellStart"/>
-      <w:r>
-        <w:t>fulfilment_warehouse_id</w:t>
-      </w:r>
-      <w:proofErr w:type="spellEnd"/>
-      <w:r>
-        <w:t xml:space="preserve"> UUID FK (nullable) — preferred warehouse for this client's outbound</w:t>
-      </w:r>
-    </w:p>
-    <w:p>
-      <w:pPr>
-        <w:pStyle w:val="ListParagraph"/>
-        <w:numPr>
-          <w:ilvl w:val="0"/>
-          <w:numId w:val="2"/>
-        </w:numPr>
-        <w:spacing w:before="40" w:after="40"/>
-      </w:pPr>
-      <w:r>
-        <w:t xml:space="preserve">warehouses </w:t>
-      </w:r>
-      <w:proofErr w:type="gramStart"/>
-      <w:r>
-        <w:t>table:</w:t>
-      </w:r>
-      <w:proofErr w:type="gramEnd"/>
-      <w:r>
-        <w:t xml:space="preserve"> add </w:t>
-      </w:r>
-      <w:proofErr w:type="spellStart"/>
-      <w:r>
-        <w:t>fulfilment_priority</w:t>
-      </w:r>
-      <w:proofErr w:type="spellEnd"/>
-      <w:r>
-        <w:t xml:space="preserve"> integer (default 100) — lower = higher priority</w:t>
-      </w:r>
-    </w:p>
-    <w:p>
-      <w:pPr>
-        <w:pStyle w:val="ListParagraph"/>
-        <w:numPr>
-          <w:ilvl w:val="0"/>
-          <w:numId w:val="2"/>
-        </w:numPr>
-        <w:spacing w:before="40" w:after="40"/>
-      </w:pPr>
-      <w:r>
-        <w:t xml:space="preserve">No schema changes to </w:t>
-      </w:r>
-      <w:proofErr w:type="spellStart"/>
-      <w:r>
-        <w:t>pick_lists</w:t>
-      </w:r>
-      <w:proofErr w:type="spellEnd"/>
-      <w:r>
-        <w:t xml:space="preserve"> or orders tables required</w:t>
-      </w:r>
-    </w:p>
-    <w:p>
-      <w:pPr>
-        <w:spacing w:before="160" w:after="60"/>
-      </w:pPr>
-      <w:r>
-        <w:rPr>
-          <w:b/>
-          <w:bCs/>
-          <w:color w:val="1A3C5E"/>
-        </w:rPr>
-        <w:t>Test coverage</w:t>
-      </w:r>
-    </w:p>
-    <w:p>
-      <w:pPr>
-        <w:pStyle w:val="ListParagraph"/>
-        <w:numPr>
-          <w:ilvl w:val="0"/>
-          <w:numId w:val="2"/>
-        </w:numPr>
-        <w:spacing w:before="40" w:after="40"/>
-      </w:pPr>
-      <w:r>
-        <w:t xml:space="preserve">Unit: </w:t>
-      </w:r>
-      <w:proofErr w:type="spellStart"/>
-      <w:r>
-        <w:t>resolveOptimalWarehouse</w:t>
-      </w:r>
-      <w:proofErr w:type="spellEnd"/>
-      <w:r>
-        <w:t xml:space="preserve"> returns correct warehouse when one has stock and another does not</w:t>
-      </w:r>
-    </w:p>
-    <w:p>
-      <w:pPr>
-        <w:pStyle w:val="ListParagraph"/>
-        <w:numPr>
-          <w:ilvl w:val="0"/>
-          <w:numId w:val="2"/>
-        </w:numPr>
-        <w:spacing w:before="40" w:after="40"/>
-      </w:pPr>
-      <w:r>
-        <w:t>Unit: returns client preferred warehouse when stock is available there</w:t>
-      </w:r>
-    </w:p>
-    <w:p>
-      <w:pPr>
-        <w:pStyle w:val="ListParagraph"/>
-        <w:numPr>
-          <w:ilvl w:val="0"/>
-          <w:numId w:val="2"/>
-        </w:numPr>
-        <w:spacing w:before="40" w:after="40"/>
-      </w:pPr>
-      <w:r>
-        <w:t xml:space="preserve">Integration: </w:t>
-      </w:r>
-      <w:proofErr w:type="spellStart"/>
-      <w:r>
-        <w:t>createPickListFlow</w:t>
-      </w:r>
-      <w:proofErr w:type="spellEnd"/>
-      <w:r>
-        <w:t xml:space="preserve"> with auto-assign creates pick tasks in the resolved warehouse</w:t>
-      </w:r>
-    </w:p>
-    <w:p>
-      <w:pPr>
-        <w:spacing w:before="80" w:after="80"/>
-      </w:pPr>
-    </w:p>
-    <w:p>
-      <w:pPr>
-        <w:spacing w:before="80" w:after="80"/>
-      </w:pPr>
-    </w:p>
-    <w:p>
-      <w:pPr>
-        <w:spacing w:before="240" w:after="80"/>
-      </w:pPr>
-      <w:r>
-        <w:rPr>
-          <w:b/>
-          <w:bCs/>
-          <w:color w:val="8B1A1A"/>
-          <w:sz w:val="25"/>
-          <w:szCs w:val="25"/>
-        </w:rPr>
-        <w:t>Gap 2: Smart Count — No-Freeze Cycle Counting</w:t>
-      </w:r>
-    </w:p>
-    <w:p>
-      <w:pPr>
-        <w:spacing w:before="160" w:after="60"/>
-      </w:pPr>
-      <w:r>
-        <w:rPr>
-          <w:b/>
-          <w:bCs/>
-          <w:color w:val="1A3C5E"/>
-        </w:rPr>
-        <w:t>What it does</w:t>
-      </w:r>
-    </w:p>
-    <w:p>
-      <w:pPr>
-        <w:spacing w:before="60" w:after="60"/>
-      </w:pPr>
-      <w:r>
-        <w:t xml:space="preserve">Cycle counts proceed without locking inventory. The system records the inventory snapshot </w:t>
-      </w:r>
-      <w:proofErr w:type="gramStart"/>
-      <w:r>
-        <w:t>at the moment</w:t>
-      </w:r>
-      <w:proofErr w:type="gramEnd"/>
-      <w:r>
-        <w:t xml:space="preserve"> each item's count begins, tracks any transactions that touch those items during the count, and alerts the counter to recount if the quantity has changed — rather than freezing the whole location.</w:t>
-      </w:r>
-    </w:p>
-    <w:p>
-      <w:pPr>
-        <w:spacing w:before="160" w:after="60"/>
-      </w:pPr>
-      <w:r>
-        <w:rPr>
-          <w:b/>
-          <w:bCs/>
-          <w:color w:val="1A3C5E"/>
-        </w:rPr>
-        <w:t>Current state</w:t>
-      </w:r>
-    </w:p>
-    <w:p>
-      <w:pPr>
-        <w:spacing w:before="60" w:after="60"/>
-      </w:pPr>
-      <w:proofErr w:type="spellStart"/>
-      <w:r>
-        <w:t>createCycleCountFlow</w:t>
-      </w:r>
-      <w:proofErr w:type="spellEnd"/>
-      <w:r>
-        <w:t xml:space="preserve"> (</w:t>
-      </w:r>
-      <w:proofErr w:type="spellStart"/>
-      <w:r>
-        <w:t>wms-core.ts</w:t>
-      </w:r>
-      <w:proofErr w:type="spellEnd"/>
-      <w:r>
-        <w:t xml:space="preserve"> ~line 1950) creates a </w:t>
-      </w:r>
-      <w:proofErr w:type="spellStart"/>
-      <w:r>
-        <w:t>cycle_count</w:t>
-      </w:r>
-      <w:proofErr w:type="spellEnd"/>
-      <w:r>
-        <w:t xml:space="preserve"> record and </w:t>
-      </w:r>
-      <w:proofErr w:type="spellStart"/>
-      <w:r>
-        <w:t>cycle_count_lines</w:t>
-      </w:r>
-      <w:proofErr w:type="spellEnd"/>
-      <w:r>
-        <w:t xml:space="preserve"> per item. </w:t>
-      </w:r>
-      <w:proofErr w:type="spellStart"/>
-      <w:r>
-        <w:t>submitCycleCountLine</w:t>
-      </w:r>
-      <w:proofErr w:type="spellEnd"/>
-      <w:r>
-        <w:t xml:space="preserve"> (~line 1996) submits a counted quantity and calculates variance. There is no mid-count transaction monitoring or snapshot reconciliation logic.</w:t>
-      </w:r>
-    </w:p>
-    <w:p>
-      <w:pPr>
-        <w:spacing w:before="160" w:after="60"/>
-      </w:pPr>
-      <w:r>
-        <w:rPr>
-          <w:b/>
-          <w:bCs/>
-          <w:color w:val="1A3C5E"/>
-        </w:rPr>
-        <w:t>Recommended approach</w:t>
-      </w:r>
-    </w:p>
-    <w:p>
-      <w:pPr>
-        <w:pStyle w:val="ListParagraph"/>
-        <w:numPr>
-          <w:ilvl w:val="0"/>
-          <w:numId w:val="2"/>
-        </w:numPr>
-        <w:spacing w:before="40" w:after="40"/>
-      </w:pPr>
-      <w:r>
-        <w:t xml:space="preserve">On </w:t>
-      </w:r>
-      <w:proofErr w:type="spellStart"/>
-      <w:r>
-        <w:t>createCycleCountFlow</w:t>
-      </w:r>
-      <w:proofErr w:type="spellEnd"/>
-      <w:r>
-        <w:t xml:space="preserve">: for each </w:t>
-      </w:r>
-      <w:proofErr w:type="spellStart"/>
-      <w:r>
-        <w:t>cycle_count_line</w:t>
-      </w:r>
-      <w:proofErr w:type="spellEnd"/>
-      <w:r>
-        <w:t xml:space="preserve">, record </w:t>
-      </w:r>
-      <w:proofErr w:type="spellStart"/>
-      <w:r>
-        <w:t>snapshot_quantity</w:t>
-      </w:r>
-      <w:proofErr w:type="spellEnd"/>
-      <w:r>
-        <w:t xml:space="preserve"> = current </w:t>
-      </w:r>
-      <w:proofErr w:type="spellStart"/>
-      <w:r>
-        <w:t>available_quantity</w:t>
-      </w:r>
-      <w:proofErr w:type="spellEnd"/>
-      <w:r>
-        <w:t xml:space="preserve"> at the time the line is created (already done via the </w:t>
-      </w:r>
-      <w:proofErr w:type="spellStart"/>
-      <w:r>
-        <w:t>count_sheet</w:t>
-      </w:r>
-      <w:proofErr w:type="spellEnd"/>
-      <w:r>
-        <w:t xml:space="preserve"> snapshot; verify the timestamp is stored per-line, not per-count-header).</w:t>
-      </w:r>
-    </w:p>
-    <w:p>
-      <w:pPr>
-        <w:pStyle w:val="ListParagraph"/>
-        <w:numPr>
-          <w:ilvl w:val="0"/>
-          <w:numId w:val="2"/>
-        </w:numPr>
-        <w:spacing w:before="40" w:after="40"/>
-      </w:pPr>
-      <w:r>
-        <w:t xml:space="preserve">Add a </w:t>
-      </w:r>
-      <w:proofErr w:type="spellStart"/>
-      <w:r>
-        <w:t>counted_snapshot_at</w:t>
-      </w:r>
-      <w:proofErr w:type="spellEnd"/>
-      <w:r>
-        <w:t xml:space="preserve"> timestamp column to </w:t>
-      </w:r>
-      <w:proofErr w:type="spellStart"/>
-      <w:r>
-        <w:t>cycle_count_lines</w:t>
-      </w:r>
-      <w:proofErr w:type="spellEnd"/>
-      <w:r>
-        <w:t>.</w:t>
-      </w:r>
-    </w:p>
-    <w:p>
-      <w:pPr>
-        <w:pStyle w:val="ListParagraph"/>
-        <w:numPr>
-          <w:ilvl w:val="0"/>
-          <w:numId w:val="2"/>
-        </w:numPr>
-        <w:spacing w:before="40" w:after="40"/>
-      </w:pPr>
-      <w:r>
-        <w:t xml:space="preserve">On </w:t>
-      </w:r>
-      <w:proofErr w:type="spellStart"/>
-      <w:r>
-        <w:t>submitCycleCountLine</w:t>
-      </w:r>
-      <w:proofErr w:type="spellEnd"/>
-      <w:r>
-        <w:t xml:space="preserve">: before accepting the submission, query </w:t>
-      </w:r>
-      <w:proofErr w:type="spellStart"/>
-      <w:r>
-        <w:t>audit_events</w:t>
-      </w:r>
-      <w:proofErr w:type="spellEnd"/>
-      <w:r>
-        <w:t xml:space="preserve"> (or </w:t>
-      </w:r>
-      <w:proofErr w:type="spellStart"/>
-      <w:r>
-        <w:t>inventory_</w:t>
-      </w:r>
-      <w:proofErr w:type="gramStart"/>
-      <w:r>
-        <w:t>lots</w:t>
-      </w:r>
-      <w:proofErr w:type="spellEnd"/>
-      <w:proofErr w:type="gramEnd"/>
-      <w:r>
-        <w:t xml:space="preserve"> movements) for any transactions on that pallet/lot since </w:t>
-      </w:r>
-      <w:proofErr w:type="spellStart"/>
-      <w:r>
-        <w:t>counted_snapshot_at</w:t>
-      </w:r>
-      <w:proofErr w:type="spellEnd"/>
-      <w:r>
-        <w:t>. If movement detected, set line status to "recount" and surface a warning toast — do not auto-submit.</w:t>
-      </w:r>
-    </w:p>
-    <w:p>
-      <w:pPr>
-        <w:pStyle w:val="ListParagraph"/>
-        <w:numPr>
-          <w:ilvl w:val="0"/>
-          <w:numId w:val="2"/>
-        </w:numPr>
-        <w:spacing w:before="40" w:after="40"/>
-      </w:pPr>
-      <w:r>
-        <w:t xml:space="preserve">Add a recount status to the cycle count line status </w:t>
-      </w:r>
-      <w:proofErr w:type="spellStart"/>
-      <w:r>
-        <w:t>enum</w:t>
-      </w:r>
-      <w:proofErr w:type="spellEnd"/>
-      <w:r>
-        <w:t xml:space="preserve"> alongside "pending", "counted", "exception".</w:t>
-      </w:r>
-    </w:p>
-    <w:p>
-      <w:pPr>
-        <w:pStyle w:val="ListParagraph"/>
-        <w:numPr>
-          <w:ilvl w:val="0"/>
-          <w:numId w:val="2"/>
-        </w:numPr>
-        <w:spacing w:before="40" w:after="40"/>
-      </w:pPr>
-      <w:r>
-        <w:t>On the cycle count UI (</w:t>
-      </w:r>
-      <w:proofErr w:type="spellStart"/>
-      <w:r>
-        <w:t>wms-ui.tsx</w:t>
-      </w:r>
-      <w:proofErr w:type="spellEnd"/>
-      <w:r>
-        <w:t xml:space="preserve"> </w:t>
-      </w:r>
-      <w:proofErr w:type="spellStart"/>
-      <w:r>
-        <w:t>CycleCountsSection</w:t>
-      </w:r>
-      <w:proofErr w:type="spellEnd"/>
-      <w:r>
-        <w:t>), show a recount badge on affected lines with the movement detail (what moved, how much, when).</w:t>
-      </w:r>
-    </w:p>
-    <w:p>
-      <w:pPr>
-        <w:pStyle w:val="ListParagraph"/>
-        <w:numPr>
-          <w:ilvl w:val="0"/>
-          <w:numId w:val="2"/>
-        </w:numPr>
-        <w:spacing w:before="40" w:after="40"/>
-      </w:pPr>
-      <w:r>
-        <w:t>Expose a "Confirm recount" action that clears the flag and allows a fresh count submission.</w:t>
-      </w:r>
-    </w:p>
-    <w:p>
-      <w:pPr>
-        <w:spacing w:before="160" w:after="60"/>
-      </w:pPr>
-      <w:r>
-        <w:rPr>
-          <w:b/>
-          <w:bCs/>
-          <w:color w:val="1A3C5E"/>
-        </w:rPr>
-        <w:t>Database changes</w:t>
-      </w:r>
-    </w:p>
-    <w:p>
-      <w:pPr>
-        <w:pStyle w:val="ListParagraph"/>
-        <w:numPr>
-          <w:ilvl w:val="0"/>
-          <w:numId w:val="2"/>
-        </w:numPr>
-        <w:spacing w:before="40" w:after="40"/>
-      </w:pPr>
-      <w:proofErr w:type="spellStart"/>
-      <w:r>
-        <w:t>cycle_count_lines</w:t>
-      </w:r>
-      <w:proofErr w:type="spellEnd"/>
-      <w:r>
-        <w:t xml:space="preserve">: add </w:t>
-      </w:r>
-      <w:proofErr w:type="spellStart"/>
-      <w:r>
-        <w:t>snapshot_quantity</w:t>
-      </w:r>
-      <w:proofErr w:type="spellEnd"/>
-      <w:r>
-        <w:t xml:space="preserve"> integer (already likely present — confirm), </w:t>
-      </w:r>
-      <w:proofErr w:type="spellStart"/>
-      <w:r>
-        <w:t>counted_snapshot_at</w:t>
-      </w:r>
-      <w:proofErr w:type="spellEnd"/>
-      <w:r>
-        <w:t xml:space="preserve"> </w:t>
-      </w:r>
-      <w:proofErr w:type="spellStart"/>
-      <w:r>
-        <w:t>timestamptz</w:t>
-      </w:r>
-      <w:proofErr w:type="spellEnd"/>
-      <w:r>
-        <w:t xml:space="preserve">, </w:t>
-      </w:r>
-      <w:proofErr w:type="spellStart"/>
-      <w:r>
-        <w:t>movement_detected</w:t>
-      </w:r>
-      <w:proofErr w:type="spellEnd"/>
-      <w:r>
-        <w:t xml:space="preserve"> </w:t>
-      </w:r>
-      <w:proofErr w:type="spellStart"/>
-      <w:r>
-        <w:t>boolean</w:t>
-      </w:r>
-      <w:proofErr w:type="spellEnd"/>
-      <w:r>
-        <w:t xml:space="preserve"> default false</w:t>
-      </w:r>
-    </w:p>
-    <w:p>
-      <w:pPr>
-        <w:pStyle w:val="ListParagraph"/>
-        <w:numPr>
-          <w:ilvl w:val="0"/>
-          <w:numId w:val="2"/>
-        </w:numPr>
-        <w:spacing w:before="40" w:after="40"/>
-      </w:pPr>
-      <w:r>
-        <w:t xml:space="preserve">Add "recount" to the </w:t>
-      </w:r>
-      <w:proofErr w:type="spellStart"/>
-      <w:r>
-        <w:t>cycle_count_line</w:t>
-      </w:r>
-      <w:proofErr w:type="spellEnd"/>
-      <w:r>
-        <w:t xml:space="preserve"> status check constraint</w:t>
-      </w:r>
-    </w:p>
-    <w:p>
-      <w:pPr>
-        <w:spacing w:before="160" w:after="60"/>
-      </w:pPr>
-      <w:r>
-        <w:rPr>
-          <w:b/>
-          <w:bCs/>
-          <w:color w:val="1A3C5E"/>
-        </w:rPr>
-        <w:t xml:space="preserve">Test coverage (reference </w:t>
-      </w:r>
-      <w:proofErr w:type="spellStart"/>
-      <w:r>
-        <w:rPr>
-          <w:b/>
-          <w:bCs/>
-          <w:color w:val="1A3C5E"/>
-        </w:rPr>
-        <w:t>src</w:t>
-      </w:r>
-      <w:proofErr w:type="spellEnd"/>
-      <w:r>
-        <w:rPr>
-          <w:b/>
-          <w:bCs/>
-          <w:color w:val="1A3C5E"/>
-        </w:rPr>
-        <w:t>/test/</w:t>
-      </w:r>
-      <w:proofErr w:type="spellStart"/>
-      <w:r>
-        <w:rPr>
-          <w:b/>
-          <w:bCs/>
-          <w:color w:val="1A3C5E"/>
-        </w:rPr>
-        <w:t>wms-core.test.ts</w:t>
-      </w:r>
-      <w:proofErr w:type="spellEnd"/>
-      <w:r>
-        <w:rPr>
-          <w:b/>
-          <w:bCs/>
-          <w:color w:val="1A3C5E"/>
-        </w:rPr>
-        <w:t xml:space="preserve"> patterns)</w:t>
-      </w:r>
-    </w:p>
-    <w:p>
-      <w:pPr>
-        <w:pStyle w:val="ListParagraph"/>
-        <w:numPr>
-          <w:ilvl w:val="0"/>
-          <w:numId w:val="2"/>
-        </w:numPr>
-        <w:spacing w:before="40" w:after="40"/>
-      </w:pPr>
-      <w:r>
-        <w:t xml:space="preserve">Unit: </w:t>
-      </w:r>
-      <w:proofErr w:type="spellStart"/>
-      <w:r>
-        <w:t>submitCycleCountLine</w:t>
-      </w:r>
-      <w:proofErr w:type="spellEnd"/>
-      <w:r>
-        <w:t xml:space="preserve"> detects movement when </w:t>
-      </w:r>
-      <w:proofErr w:type="spellStart"/>
-      <w:r>
-        <w:t>audit_events</w:t>
-      </w:r>
-      <w:proofErr w:type="spellEnd"/>
-      <w:r>
-        <w:t xml:space="preserve"> has a post-snapshot entry for that item</w:t>
-      </w:r>
-    </w:p>
-    <w:p>
-      <w:pPr>
-        <w:pStyle w:val="ListParagraph"/>
-        <w:numPr>
-          <w:ilvl w:val="0"/>
-          <w:numId w:val="2"/>
-        </w:numPr>
-        <w:spacing w:before="40" w:after="40"/>
-      </w:pPr>
-      <w:r>
-        <w:lastRenderedPageBreak/>
-        <w:t xml:space="preserve">Unit: no false positive when </w:t>
-      </w:r>
-      <w:proofErr w:type="spellStart"/>
-      <w:r>
-        <w:t>audit_events</w:t>
-      </w:r>
-      <w:proofErr w:type="spellEnd"/>
-      <w:r>
-        <w:t xml:space="preserve"> entry predates the snapshot timestamp</w:t>
-      </w:r>
-    </w:p>
-    <w:p>
-      <w:pPr>
-        <w:pStyle w:val="ListParagraph"/>
-        <w:numPr>
-          <w:ilvl w:val="0"/>
-          <w:numId w:val="2"/>
-        </w:numPr>
-        <w:spacing w:before="40" w:after="40"/>
-      </w:pPr>
-      <w:r>
-        <w:t>Integration: full count flow — create, movement occurs, submit, verify recount status set</w:t>
-      </w:r>
-    </w:p>
-    <w:p>
-      <w:pPr>
-        <w:spacing w:before="80" w:after="80"/>
-      </w:pPr>
-    </w:p>
-    <w:p>
-      <w:pPr>
-        <w:spacing w:before="80" w:after="80"/>
-      </w:pPr>
-    </w:p>
-    <w:p>
-      <w:pPr>
-        <w:spacing w:before="240" w:after="80"/>
-      </w:pPr>
-      <w:r>
-        <w:rPr>
-          <w:b/>
-          <w:bCs/>
-          <w:color w:val="8B1A1A"/>
-          <w:sz w:val="25"/>
-          <w:szCs w:val="25"/>
-        </w:rPr>
-        <w:t>Gap 3: Return Authorization Receiving</w:t>
-      </w:r>
-    </w:p>
-    <w:p>
-      <w:pPr>
-        <w:spacing w:before="160" w:after="60"/>
-      </w:pPr>
-      <w:r>
-        <w:rPr>
-          <w:b/>
-          <w:bCs/>
-          <w:color w:val="1A3C5E"/>
-        </w:rPr>
-        <w:t>What it does</w:t>
-      </w:r>
-    </w:p>
-    <w:p>
-      <w:pPr>
-        <w:spacing w:before="60" w:after="60"/>
-      </w:pPr>
-      <w:r>
-        <w:t>Warehouse staff can receive goods against a Return Authorization (RA) record — confirming item, quantity, condition, and linking the inbound stock movement back to the original order or RA document. Currently only a returns location type exists; there is no RA document or RA-linked receiving workflow.</w:t>
-      </w:r>
-    </w:p>
-    <w:p>
-      <w:pPr>
-        <w:spacing w:before="160" w:after="60"/>
-      </w:pPr>
-      <w:r>
-        <w:rPr>
-          <w:b/>
-          <w:bCs/>
-          <w:color w:val="1A3C5E"/>
-        </w:rPr>
-        <w:t>Current state</w:t>
-      </w:r>
-    </w:p>
-    <w:p>
-      <w:pPr>
-        <w:spacing w:before="60" w:after="60"/>
-      </w:pPr>
-      <w:proofErr w:type="spellStart"/>
-      <w:r>
-        <w:t>createReceiptFlow</w:t>
-      </w:r>
-      <w:proofErr w:type="spellEnd"/>
-      <w:r>
-        <w:t xml:space="preserve"> (</w:t>
-      </w:r>
-      <w:proofErr w:type="spellStart"/>
-      <w:r>
-        <w:t>wms-core.ts</w:t>
-      </w:r>
-      <w:proofErr w:type="spellEnd"/>
-      <w:r>
-        <w:t xml:space="preserve"> ~line 1124) creates receipts of type "standard". </w:t>
-      </w:r>
-      <w:proofErr w:type="spellStart"/>
-      <w:r>
-        <w:t>receivingSchema</w:t>
-      </w:r>
-      <w:proofErr w:type="spellEnd"/>
-      <w:r>
-        <w:t xml:space="preserve"> has a </w:t>
-      </w:r>
-      <w:proofErr w:type="spellStart"/>
-      <w:r>
-        <w:t>receipt_type</w:t>
-      </w:r>
-      <w:proofErr w:type="spellEnd"/>
-      <w:r>
-        <w:t xml:space="preserve"> field that could be extended. The locations table has </w:t>
-      </w:r>
-      <w:proofErr w:type="spellStart"/>
-      <w:r>
-        <w:t>location_type</w:t>
-      </w:r>
-      <w:proofErr w:type="spellEnd"/>
-      <w:r>
-        <w:t xml:space="preserve">: "returns". There is no </w:t>
-      </w:r>
-      <w:proofErr w:type="spellStart"/>
-      <w:r>
-        <w:t>return_authorizations</w:t>
-      </w:r>
-      <w:proofErr w:type="spellEnd"/>
-      <w:r>
-        <w:t xml:space="preserve"> table or RA-linked receipt type.</w:t>
-      </w:r>
-    </w:p>
-    <w:p>
-      <w:pPr>
-        <w:spacing w:before="160" w:after="60"/>
-      </w:pPr>
-      <w:r>
-        <w:rPr>
-          <w:b/>
-          <w:bCs/>
-          <w:color w:val="1A3C5E"/>
-        </w:rPr>
-        <w:t>Recommended approach</w:t>
-      </w:r>
-    </w:p>
-    <w:p>
-      <w:pPr>
-        <w:pStyle w:val="ListParagraph"/>
-        <w:numPr>
-          <w:ilvl w:val="0"/>
-          <w:numId w:val="2"/>
-        </w:numPr>
-        <w:spacing w:before="40" w:after="40"/>
-      </w:pPr>
-      <w:r>
-        <w:t xml:space="preserve">Add </w:t>
-      </w:r>
-      <w:proofErr w:type="spellStart"/>
-      <w:r>
-        <w:t>return_authorizations</w:t>
-      </w:r>
-      <w:proofErr w:type="spellEnd"/>
-      <w:r>
-        <w:t xml:space="preserve"> table: id, </w:t>
-      </w:r>
-      <w:proofErr w:type="spellStart"/>
-      <w:r>
-        <w:t>ra_number</w:t>
-      </w:r>
-      <w:proofErr w:type="spellEnd"/>
-      <w:r>
-        <w:t xml:space="preserve">, </w:t>
-      </w:r>
-      <w:proofErr w:type="spellStart"/>
-      <w:r>
-        <w:t>client_id</w:t>
-      </w:r>
-      <w:proofErr w:type="spellEnd"/>
-      <w:r>
-        <w:t xml:space="preserve">, </w:t>
-      </w:r>
-      <w:proofErr w:type="spellStart"/>
-      <w:r>
-        <w:t>warehouse_id</w:t>
-      </w:r>
-      <w:proofErr w:type="spellEnd"/>
-      <w:r>
-        <w:t xml:space="preserve">, status (open/closed), notes, </w:t>
-      </w:r>
-      <w:proofErr w:type="spellStart"/>
-      <w:r>
-        <w:t>created_at</w:t>
-      </w:r>
-      <w:proofErr w:type="spellEnd"/>
-      <w:r>
-        <w:t>. Add to RESOURCE_DEFINITIONS for admin management.</w:t>
-      </w:r>
-    </w:p>
-    <w:p>
-      <w:pPr>
-        <w:pStyle w:val="ListParagraph"/>
-        <w:numPr>
-          <w:ilvl w:val="0"/>
-          <w:numId w:val="2"/>
-        </w:numPr>
-        <w:spacing w:before="40" w:after="40"/>
-      </w:pPr>
-      <w:r>
-        <w:t xml:space="preserve">Add </w:t>
-      </w:r>
-      <w:proofErr w:type="spellStart"/>
-      <w:r>
-        <w:t>return_authorization_lines</w:t>
-      </w:r>
-      <w:proofErr w:type="spellEnd"/>
-      <w:r>
-        <w:t xml:space="preserve"> table: id, </w:t>
-      </w:r>
-      <w:proofErr w:type="spellStart"/>
-      <w:r>
-        <w:t>ra_id</w:t>
-      </w:r>
-      <w:proofErr w:type="spellEnd"/>
-      <w:r>
-        <w:t xml:space="preserve">, </w:t>
-      </w:r>
-      <w:proofErr w:type="spellStart"/>
-      <w:r>
-        <w:t>product_id</w:t>
-      </w:r>
-      <w:proofErr w:type="spellEnd"/>
-      <w:r>
-        <w:t xml:space="preserve">, </w:t>
-      </w:r>
-      <w:proofErr w:type="spellStart"/>
-      <w:r>
-        <w:t>expected_quantity</w:t>
-      </w:r>
-      <w:proofErr w:type="spellEnd"/>
-      <w:r>
-        <w:t xml:space="preserve">, </w:t>
-      </w:r>
-      <w:proofErr w:type="spellStart"/>
-      <w:r>
-        <w:t>received_quantity</w:t>
-      </w:r>
-      <w:proofErr w:type="spellEnd"/>
-      <w:r>
-        <w:t>, condition (</w:t>
-      </w:r>
-      <w:proofErr w:type="gramStart"/>
-      <w:r>
-        <w:t>as-new</w:t>
-      </w:r>
-      <w:proofErr w:type="gramEnd"/>
-      <w:r>
-        <w:t>/damaged/unknown).</w:t>
-      </w:r>
-    </w:p>
-    <w:p>
-      <w:pPr>
-        <w:pStyle w:val="ListParagraph"/>
-        <w:numPr>
-          <w:ilvl w:val="0"/>
-          <w:numId w:val="2"/>
-        </w:numPr>
-        <w:spacing w:before="40" w:after="40"/>
-      </w:pPr>
-      <w:r>
-        <w:t xml:space="preserve">Add "return" to </w:t>
-      </w:r>
-      <w:proofErr w:type="spellStart"/>
-      <w:r>
-        <w:t>receipt_type</w:t>
-      </w:r>
-      <w:proofErr w:type="spellEnd"/>
-      <w:r>
-        <w:t xml:space="preserve"> </w:t>
-      </w:r>
-      <w:proofErr w:type="spellStart"/>
-      <w:r>
-        <w:t>enum</w:t>
-      </w:r>
-      <w:proofErr w:type="spellEnd"/>
-      <w:r>
-        <w:t xml:space="preserve"> in </w:t>
-      </w:r>
-      <w:proofErr w:type="spellStart"/>
-      <w:r>
-        <w:t>receivingSchema</w:t>
-      </w:r>
-      <w:proofErr w:type="spellEnd"/>
-      <w:r>
-        <w:t xml:space="preserve">. When </w:t>
-      </w:r>
-      <w:proofErr w:type="spellStart"/>
-      <w:r>
-        <w:t>receipt_type</w:t>
-      </w:r>
-      <w:proofErr w:type="spellEnd"/>
-      <w:r>
-        <w:t xml:space="preserve"> === "return", require </w:t>
-      </w:r>
-      <w:proofErr w:type="spellStart"/>
-      <w:r>
-        <w:t>return_authorization_id</w:t>
-      </w:r>
-      <w:proofErr w:type="spellEnd"/>
-      <w:r>
-        <w:t xml:space="preserve"> (nullable otherwise).</w:t>
-      </w:r>
-    </w:p>
-    <w:p>
-      <w:pPr>
-        <w:pStyle w:val="ListParagraph"/>
-        <w:numPr>
-          <w:ilvl w:val="0"/>
-          <w:numId w:val="2"/>
-        </w:numPr>
-        <w:spacing w:before="40" w:after="40"/>
-      </w:pPr>
-      <w:r>
-        <w:t xml:space="preserve">In </w:t>
-      </w:r>
-      <w:proofErr w:type="spellStart"/>
-      <w:r>
-        <w:t>createReceiptFlow</w:t>
-      </w:r>
-      <w:proofErr w:type="spellEnd"/>
-      <w:r>
-        <w:t xml:space="preserve">: when </w:t>
-      </w:r>
-      <w:proofErr w:type="spellStart"/>
-      <w:r>
-        <w:t>return_authorization_id</w:t>
-      </w:r>
-      <w:proofErr w:type="spellEnd"/>
-      <w:r>
-        <w:t xml:space="preserve"> is provided, validate the RA is open, decrement </w:t>
-      </w:r>
-      <w:proofErr w:type="spellStart"/>
-      <w:r>
-        <w:t>expected_quantity</w:t>
-      </w:r>
-      <w:proofErr w:type="spellEnd"/>
-      <w:r>
-        <w:t xml:space="preserve"> on the matching RA line, and close the RA when all lines are fully received.</w:t>
-      </w:r>
-    </w:p>
-    <w:p>
-      <w:pPr>
-        <w:pStyle w:val="ListParagraph"/>
-        <w:numPr>
-          <w:ilvl w:val="0"/>
-          <w:numId w:val="2"/>
-        </w:numPr>
-        <w:spacing w:before="40" w:after="40"/>
-      </w:pPr>
-      <w:r>
-        <w:t>In the Receiving UI: add a "Return" tab alongside the existing receive form. The RA selector pulls open RAs for the selected warehouse/client. Pre-populates product and expected quantity from the RA line.</w:t>
-      </w:r>
-    </w:p>
-    <w:p>
-      <w:pPr>
-        <w:pStyle w:val="ListParagraph"/>
-        <w:numPr>
-          <w:ilvl w:val="0"/>
-          <w:numId w:val="2"/>
-        </w:numPr>
-        <w:spacing w:before="40" w:after="40"/>
-      </w:pPr>
-      <w:r>
-        <w:t xml:space="preserve">Route received returns to the returns zone automatically (inbound </w:t>
-      </w:r>
-      <w:proofErr w:type="spellStart"/>
-      <w:r>
-        <w:t>putaway</w:t>
-      </w:r>
-      <w:proofErr w:type="spellEnd"/>
-      <w:r>
-        <w:t xml:space="preserve"> strategy: if </w:t>
-      </w:r>
-      <w:proofErr w:type="spellStart"/>
-      <w:r>
-        <w:t>receipt_type</w:t>
-      </w:r>
-      <w:proofErr w:type="spellEnd"/>
-      <w:r>
-        <w:t xml:space="preserve"> === "return", suggest returns-type locations first).</w:t>
-      </w:r>
-    </w:p>
-    <w:p>
-      <w:pPr>
-        <w:spacing w:before="160" w:after="60"/>
-      </w:pPr>
-      <w:r>
-        <w:rPr>
-          <w:b/>
-          <w:bCs/>
-          <w:color w:val="1A3C5E"/>
-        </w:rPr>
-        <w:t>Database changes</w:t>
-      </w:r>
-    </w:p>
-    <w:p>
-      <w:pPr>
-        <w:pStyle w:val="ListParagraph"/>
-        <w:numPr>
-          <w:ilvl w:val="0"/>
-          <w:numId w:val="2"/>
-        </w:numPr>
-        <w:spacing w:before="40" w:after="40"/>
-      </w:pPr>
-      <w:r>
-        <w:t xml:space="preserve">New table: </w:t>
-      </w:r>
-      <w:proofErr w:type="spellStart"/>
-      <w:r>
-        <w:t>return_authorizations</w:t>
-      </w:r>
-      <w:proofErr w:type="spellEnd"/>
-      <w:r>
-        <w:t xml:space="preserve"> (</w:t>
-      </w:r>
-      <w:proofErr w:type="spellStart"/>
-      <w:r>
-        <w:t>ra_number</w:t>
-      </w:r>
-      <w:proofErr w:type="spellEnd"/>
-      <w:r>
-        <w:t xml:space="preserve">, </w:t>
-      </w:r>
-      <w:proofErr w:type="spellStart"/>
-      <w:r>
-        <w:t>client_id</w:t>
-      </w:r>
-      <w:proofErr w:type="spellEnd"/>
-      <w:r>
-        <w:t xml:space="preserve">, </w:t>
-      </w:r>
-      <w:proofErr w:type="spellStart"/>
-      <w:r>
-        <w:t>warehouse_id</w:t>
-      </w:r>
-      <w:proofErr w:type="spellEnd"/>
-      <w:r>
-        <w:t>, status, notes)</w:t>
-      </w:r>
-    </w:p>
-    <w:p>
-      <w:pPr>
-        <w:pStyle w:val="ListParagraph"/>
-        <w:numPr>
-          <w:ilvl w:val="0"/>
-          <w:numId w:val="2"/>
-        </w:numPr>
-        <w:spacing w:before="40" w:after="40"/>
-      </w:pPr>
-      <w:r>
-        <w:t xml:space="preserve">New table: </w:t>
-      </w:r>
-      <w:proofErr w:type="spellStart"/>
-      <w:r>
-        <w:t>return_authorization_lines</w:t>
-      </w:r>
-      <w:proofErr w:type="spellEnd"/>
-      <w:r>
-        <w:t xml:space="preserve"> (</w:t>
-      </w:r>
-      <w:proofErr w:type="spellStart"/>
-      <w:r>
-        <w:t>ra_id</w:t>
-      </w:r>
-      <w:proofErr w:type="spellEnd"/>
-      <w:r>
-        <w:t xml:space="preserve">, </w:t>
-      </w:r>
-      <w:proofErr w:type="spellStart"/>
-      <w:r>
-        <w:t>product_id</w:t>
-      </w:r>
-      <w:proofErr w:type="spellEnd"/>
-      <w:r>
-        <w:t xml:space="preserve">, </w:t>
-      </w:r>
-      <w:proofErr w:type="spellStart"/>
-      <w:r>
-        <w:t>expected_quantity</w:t>
-      </w:r>
-      <w:proofErr w:type="spellEnd"/>
-      <w:r>
-        <w:t xml:space="preserve">, </w:t>
-      </w:r>
-      <w:proofErr w:type="spellStart"/>
-      <w:r>
-        <w:t>received_quantity</w:t>
-      </w:r>
-      <w:proofErr w:type="spellEnd"/>
-      <w:r>
-        <w:t>, condition)</w:t>
-      </w:r>
-    </w:p>
-    <w:p>
-      <w:pPr>
-        <w:pStyle w:val="ListParagraph"/>
-        <w:numPr>
-          <w:ilvl w:val="0"/>
-          <w:numId w:val="2"/>
-        </w:numPr>
-        <w:spacing w:before="40" w:after="40"/>
-      </w:pPr>
-      <w:r>
-        <w:t xml:space="preserve">receipts </w:t>
-      </w:r>
-      <w:proofErr w:type="gramStart"/>
-      <w:r>
-        <w:t>table:</w:t>
-      </w:r>
-      <w:proofErr w:type="gramEnd"/>
-      <w:r>
-        <w:t xml:space="preserve"> add </w:t>
-      </w:r>
-      <w:proofErr w:type="spellStart"/>
-      <w:r>
-        <w:t>receipt_type</w:t>
-      </w:r>
-      <w:proofErr w:type="spellEnd"/>
-      <w:r>
-        <w:t xml:space="preserve"> text default "standard", </w:t>
-      </w:r>
-      <w:proofErr w:type="spellStart"/>
-      <w:r>
-        <w:t>return_authorization_id</w:t>
-      </w:r>
-      <w:proofErr w:type="spellEnd"/>
-      <w:r>
-        <w:t xml:space="preserve"> UUID FK nullable</w:t>
-      </w:r>
-    </w:p>
-    <w:p>
-      <w:pPr>
-        <w:spacing w:before="160" w:after="60"/>
-      </w:pPr>
-      <w:r>
-        <w:rPr>
-          <w:b/>
-          <w:bCs/>
-          <w:color w:val="1A3C5E"/>
-        </w:rPr>
-        <w:t>Test coverage</w:t>
-      </w:r>
-    </w:p>
-    <w:p>
-      <w:pPr>
-        <w:pStyle w:val="ListParagraph"/>
-        <w:numPr>
-          <w:ilvl w:val="0"/>
-          <w:numId w:val="2"/>
-        </w:numPr>
-        <w:spacing w:before="40" w:after="40"/>
-      </w:pPr>
-      <w:r>
-        <w:t xml:space="preserve">Unit: </w:t>
-      </w:r>
-      <w:proofErr w:type="spellStart"/>
-      <w:r>
-        <w:t>createReceiptFlow</w:t>
-      </w:r>
-      <w:proofErr w:type="spellEnd"/>
-      <w:r>
-        <w:t xml:space="preserve"> with return type links receipt to RA and decrements </w:t>
-      </w:r>
-      <w:proofErr w:type="spellStart"/>
-      <w:r>
-        <w:t>expected_quantity</w:t>
-      </w:r>
-      <w:proofErr w:type="spellEnd"/>
-    </w:p>
-    <w:p>
-      <w:pPr>
-        <w:pStyle w:val="ListParagraph"/>
-        <w:numPr>
-          <w:ilvl w:val="0"/>
-          <w:numId w:val="2"/>
-        </w:numPr>
-        <w:spacing w:before="40" w:after="40"/>
-      </w:pPr>
-      <w:r>
-        <w:t>Unit: RA status closes when all lines are fully received</w:t>
-      </w:r>
-    </w:p>
-    <w:p>
-      <w:pPr>
-        <w:pStyle w:val="ListParagraph"/>
-        <w:numPr>
-          <w:ilvl w:val="0"/>
-          <w:numId w:val="2"/>
-        </w:numPr>
-        <w:spacing w:before="40" w:after="40"/>
-      </w:pPr>
-      <w:r>
-        <w:t>Unit: receiving against a closed RA throws a validation error</w:t>
-      </w:r>
-    </w:p>
-    <w:p>
-      <w:pPr>
-        <w:spacing w:before="80" w:after="80"/>
-      </w:pPr>
-    </w:p>
-    <w:p>
-      <w:pPr>
-        <w:spacing w:before="80" w:after="80"/>
-      </w:pPr>
-    </w:p>
-    <w:p>
-      <w:pPr>
-        <w:spacing w:before="240" w:after="80"/>
-      </w:pPr>
-      <w:r>
-        <w:rPr>
-          <w:b/>
-          <w:bCs/>
-          <w:color w:val="8B1A1A"/>
-          <w:sz w:val="25"/>
-          <w:szCs w:val="25"/>
-        </w:rPr>
-        <w:t>Gap 4: Native Mobile App</w:t>
-      </w:r>
-    </w:p>
-    <w:p>
-      <w:pPr>
-        <w:spacing w:before="160" w:after="60"/>
-      </w:pPr>
-      <w:r>
-        <w:rPr>
-          <w:b/>
-          <w:bCs/>
-          <w:color w:val="1A3C5E"/>
-        </w:rPr>
-        <w:t>What it does</w:t>
-      </w:r>
-    </w:p>
-    <w:p>
-      <w:pPr>
-        <w:spacing w:before="60" w:after="60"/>
-      </w:pPr>
-      <w:r>
-        <w:lastRenderedPageBreak/>
-        <w:t>A dedicated iOS/Android app with offline capability, rugged-device optimisations (large touch targets, Zebra scanner SDK integration, reduced data usage), and push notifications for task assignments.</w:t>
-      </w:r>
-    </w:p>
-    <w:p>
-      <w:pPr>
-        <w:spacing w:before="160" w:after="60"/>
-      </w:pPr>
-      <w:r>
-        <w:rPr>
-          <w:b/>
-          <w:bCs/>
-          <w:color w:val="1A3C5E"/>
-        </w:rPr>
-        <w:t>Current state</w:t>
-      </w:r>
-    </w:p>
-    <w:p>
-      <w:pPr>
-        <w:spacing w:before="60" w:after="60"/>
-      </w:pPr>
-      <w:r>
-        <w:t xml:space="preserve">The app is a React SPA (Vite + React Router) with responsive layout and a </w:t>
-      </w:r>
-      <w:proofErr w:type="spellStart"/>
-      <w:r>
-        <w:t>BarcodeScanButton</w:t>
-      </w:r>
-      <w:proofErr w:type="spellEnd"/>
-      <w:r>
-        <w:t xml:space="preserve"> component (</w:t>
-      </w:r>
-      <w:proofErr w:type="spellStart"/>
-      <w:r>
-        <w:t>src</w:t>
-      </w:r>
-      <w:proofErr w:type="spellEnd"/>
-      <w:r>
-        <w:t>/components/barcode-scan-</w:t>
-      </w:r>
-      <w:proofErr w:type="spellStart"/>
-      <w:r>
-        <w:t>button.tsx</w:t>
-      </w:r>
-      <w:proofErr w:type="spellEnd"/>
-      <w:r>
-        <w:t>) that uses the browser camera or USB HID scan input. The existing mobile toolbar (TOOLBAR_STORAGE_KEY in use-feature-</w:t>
-      </w:r>
-      <w:proofErr w:type="spellStart"/>
-      <w:r>
-        <w:t>flags.ts</w:t>
-      </w:r>
-      <w:proofErr w:type="spellEnd"/>
-      <w:r>
-        <w:t>) pins the top 4 modules for mobile quick access. The app is fully functional on mobile browsers.</w:t>
-      </w:r>
-    </w:p>
-    <w:p>
-      <w:pPr>
-        <w:spacing w:before="160" w:after="60"/>
-      </w:pPr>
-      <w:r>
-        <w:rPr>
-          <w:b/>
-          <w:bCs/>
-          <w:color w:val="1A3C5E"/>
-        </w:rPr>
-        <w:t>Recommended approach — Progressive Web App (lowest effort, highest ROI)</w:t>
-      </w:r>
-    </w:p>
-    <w:p>
-      <w:pPr>
-        <w:spacing w:before="60" w:after="60"/>
-      </w:pPr>
-      <w:r>
-        <w:t>Before building a native app, ship a PWA. This addresses 80% of native app UX concerns with near-zero additional codebase work:</w:t>
-      </w:r>
-    </w:p>
-    <w:p>
-      <w:pPr>
-        <w:pStyle w:val="ListParagraph"/>
-        <w:numPr>
-          <w:ilvl w:val="0"/>
-          <w:numId w:val="2"/>
-        </w:numPr>
-        <w:spacing w:before="40" w:after="40"/>
-      </w:pPr>
-      <w:r>
-        <w:t>Add a service worker (</w:t>
-      </w:r>
-      <w:proofErr w:type="spellStart"/>
-      <w:r>
-        <w:t>vite</w:t>
-      </w:r>
-      <w:proofErr w:type="spellEnd"/>
-      <w:r>
-        <w:t>-plugin-</w:t>
-      </w:r>
-      <w:proofErr w:type="spellStart"/>
-      <w:r>
-        <w:t>pwa</w:t>
-      </w:r>
-      <w:proofErr w:type="spellEnd"/>
-      <w:r>
-        <w:t>) for offline caching of the app shell, last-fetched dashboard metrics, and pending task queue.</w:t>
-      </w:r>
-    </w:p>
-    <w:p>
-      <w:pPr>
-        <w:pStyle w:val="ListParagraph"/>
-        <w:numPr>
-          <w:ilvl w:val="0"/>
-          <w:numId w:val="2"/>
-        </w:numPr>
-        <w:spacing w:before="40" w:after="40"/>
-      </w:pPr>
-      <w:r>
-        <w:t xml:space="preserve">Add a </w:t>
-      </w:r>
-      <w:proofErr w:type="spellStart"/>
-      <w:r>
-        <w:t>manifest.json</w:t>
-      </w:r>
-      <w:proofErr w:type="spellEnd"/>
-      <w:r>
-        <w:t xml:space="preserve"> with icons, theme colour (#1a3c5e), display: standalone — enables "Add to Home Screen" on iOS and Android.</w:t>
-      </w:r>
-    </w:p>
-    <w:p>
-      <w:pPr>
-        <w:pStyle w:val="ListParagraph"/>
-        <w:numPr>
-          <w:ilvl w:val="0"/>
-          <w:numId w:val="2"/>
-        </w:numPr>
-        <w:spacing w:before="40" w:after="40"/>
-      </w:pPr>
-      <w:r>
-        <w:t>Add an offline task queue: when the network is unavailable (use-network-</w:t>
-      </w:r>
-      <w:proofErr w:type="spellStart"/>
-      <w:r>
-        <w:t>status.ts</w:t>
-      </w:r>
-      <w:proofErr w:type="spellEnd"/>
-      <w:r>
-        <w:t xml:space="preserve"> already exposes </w:t>
-      </w:r>
-      <w:proofErr w:type="spellStart"/>
-      <w:r>
-        <w:t>isOnline</w:t>
-      </w:r>
-      <w:proofErr w:type="spellEnd"/>
-      <w:r>
-        <w:t xml:space="preserve">), buffer </w:t>
-      </w:r>
-      <w:proofErr w:type="spellStart"/>
-      <w:r>
-        <w:t>putaway</w:t>
-      </w:r>
-      <w:proofErr w:type="spellEnd"/>
-      <w:r>
-        <w:t xml:space="preserve"> confirmations and pick task submissions to </w:t>
-      </w:r>
-      <w:proofErr w:type="spellStart"/>
-      <w:r>
-        <w:t>IndexedDB</w:t>
-      </w:r>
-      <w:proofErr w:type="spellEnd"/>
-      <w:r>
-        <w:t xml:space="preserve"> and replay on reconnect.</w:t>
-      </w:r>
-    </w:p>
-    <w:p>
-      <w:pPr>
-        <w:pStyle w:val="ListParagraph"/>
-        <w:numPr>
-          <w:ilvl w:val="0"/>
-          <w:numId w:val="2"/>
-        </w:numPr>
-        <w:spacing w:before="40" w:after="40"/>
-      </w:pPr>
-      <w:r>
-        <w:t xml:space="preserve">Optimise touch targets: audit all interactive elements in </w:t>
-      </w:r>
-      <w:proofErr w:type="spellStart"/>
-      <w:r>
-        <w:t>wms-ui.tsx</w:t>
-      </w:r>
-      <w:proofErr w:type="spellEnd"/>
-      <w:r>
-        <w:t xml:space="preserve"> for minimum 44px tap target height on mobile breakpoints.</w:t>
-      </w:r>
-    </w:p>
-    <w:p>
-      <w:pPr>
-        <w:spacing w:before="160" w:after="60"/>
-      </w:pPr>
-      <w:r>
-        <w:rPr>
-          <w:b/>
-          <w:bCs/>
-          <w:color w:val="1A3C5E"/>
-        </w:rPr>
-        <w:t>Recommended approach — Native app (higher effort, required for Zebra SDK)</w:t>
-      </w:r>
-    </w:p>
-    <w:p>
-      <w:pPr>
-        <w:pStyle w:val="ListParagraph"/>
-        <w:numPr>
-          <w:ilvl w:val="0"/>
-          <w:numId w:val="2"/>
-        </w:numPr>
-        <w:spacing w:before="40" w:after="40"/>
-      </w:pPr>
-      <w:r>
-        <w:t>Use Capacitor (not React Native) to wrap the existing React SPA. This reuses the entire codebase with minimal changes — Capacitor bridges native APIs as plugins.</w:t>
-      </w:r>
-    </w:p>
-    <w:p>
-      <w:pPr>
-        <w:pStyle w:val="ListParagraph"/>
-        <w:numPr>
-          <w:ilvl w:val="0"/>
-          <w:numId w:val="2"/>
-        </w:numPr>
-        <w:spacing w:before="40" w:after="40"/>
-      </w:pPr>
-      <w:r>
-        <w:t xml:space="preserve">Replace </w:t>
-      </w:r>
-      <w:proofErr w:type="spellStart"/>
-      <w:r>
-        <w:t>BarcodeScanButton</w:t>
-      </w:r>
-      <w:proofErr w:type="spellEnd"/>
-      <w:r>
-        <w:t xml:space="preserve"> camera scan with the Capacitor Zebra </w:t>
-      </w:r>
-      <w:proofErr w:type="spellStart"/>
-      <w:r>
-        <w:t>DataWedge</w:t>
-      </w:r>
-      <w:proofErr w:type="spellEnd"/>
-      <w:r>
-        <w:t xml:space="preserve"> plugin for hardware trigger scanning on TC-series devices.</w:t>
-      </w:r>
-    </w:p>
-    <w:p>
-      <w:pPr>
-        <w:pStyle w:val="ListParagraph"/>
-        <w:numPr>
-          <w:ilvl w:val="0"/>
-          <w:numId w:val="2"/>
-        </w:numPr>
-        <w:spacing w:before="40" w:after="40"/>
-      </w:pPr>
-      <w:r>
-        <w:t>Add Capacitor Push Notifications plugin for task assignment alerts.</w:t>
-      </w:r>
-    </w:p>
-    <w:p>
-      <w:pPr>
-        <w:pStyle w:val="ListParagraph"/>
-        <w:numPr>
-          <w:ilvl w:val="0"/>
-          <w:numId w:val="2"/>
-        </w:numPr>
-        <w:spacing w:before="40" w:after="40"/>
-      </w:pPr>
-      <w:r>
-        <w:t>Estimated effort: 2–3 sprints for PWA baseline; 4–6 additional sprints for Capacitor/Zebra native wrapper.</w:t>
-      </w:r>
-    </w:p>
-    <w:p>
-      <w:pPr>
-        <w:spacing w:before="160" w:after="60"/>
-      </w:pPr>
-      <w:r>
-        <w:rPr>
-          <w:b/>
-          <w:bCs/>
-          <w:color w:val="1A3C5E"/>
-        </w:rPr>
-        <w:t>No database changes required</w:t>
-      </w:r>
-    </w:p>
-    <w:p>
-      <w:pPr>
-        <w:spacing w:before="60" w:after="60"/>
-      </w:pPr>
-      <w:r>
-        <w:t xml:space="preserve">All mobile workflows use existing API functions in </w:t>
-      </w:r>
-      <w:proofErr w:type="spellStart"/>
-      <w:r>
-        <w:t>wms-core.ts</w:t>
-      </w:r>
-      <w:proofErr w:type="spellEnd"/>
-      <w:r>
-        <w:t>. The offline queue is a client-side concern only.</w:t>
-      </w:r>
-    </w:p>
-    <w:p>
-      <w:pPr>
-        <w:spacing w:before="80" w:after="80"/>
-      </w:pPr>
-    </w:p>
-    <w:p>
-      <w:pPr>
-        <w:spacing w:before="80" w:after="80"/>
-      </w:pPr>
-    </w:p>
-    <w:p>
-      <w:pPr>
-        <w:pStyle w:val="Heading1"/>
-      </w:pPr>
-      <w:r>
-        <w:t>Recommended Build Sequence</w:t>
-      </w:r>
-    </w:p>
-    <w:p>
-      <w:pPr>
-        <w:spacing w:before="60" w:after="60"/>
-      </w:pPr>
-      <w:r>
-        <w:t>Based on complexity, dependency, and client impact:</w:t>
-      </w:r>
-    </w:p>
-    <w:tbl>
-      <w:tblPr>
-        <w:tblW w:w="9360" w:type="dxa"/>
-        <w:tblBorders>
-          <w:top w:val="single" w:sz="4" w:space="0" w:color="auto"/>
-          <w:left w:val="single" w:sz="4" w:space="0" w:color="auto"/>
-          <w:bottom w:val="single" w:sz="4" w:space="0" w:color="auto"/>
-          <w:right w:val="single" w:sz="4" w:space="0" w:color="auto"/>
-          <w:insideH w:val="single" w:sz="4" w:space="0" w:color="auto"/>
-          <w:insideV w:val="single" w:sz="4" w:space="0" w:color="auto"/>
-        </w:tblBorders>
-        <w:tblCellMar>
-          <w:left w:w="10" w:type="dxa"/>
-          <w:right w:w="10" w:type="dxa"/>
-        </w:tblCellMar>
-        <w:tblLook w:val="04A0" w:firstRow="1" w:lastRow="0" w:firstColumn="1" w:lastColumn="0" w:noHBand="0" w:noVBand="1"/>
-      </w:tblPr>
-      <w:tblGrid>
-        <w:gridCol w:w="1200"/>
-        <w:gridCol w:w="3000"/>
-        <w:gridCol w:w="5160"/>
-      </w:tblGrid>
-      <w:tr>
-        <w:tblPrEx>
-          <w:tblCellMar>
-            <w:top w:w="0" w:type="dxa"/>
-            <w:bottom w:w="0" w:type="dxa"/>
-          </w:tblCellMar>
-        </w:tblPrEx>
-        <w:tc>
-          <w:tcPr>
-            <w:tcW w:w="1200" w:type="dxa"/>
-            <w:tcBorders>
-              <w:top w:val="single" w:sz="1" w:space="0" w:color="CCCCCC"/>
-              <w:left w:val="single" w:sz="1" w:space="0" w:color="CCCCCC"/>
-              <w:bottom w:val="single" w:sz="1" w:space="0" w:color="CCCCCC"/>
-              <w:right w:val="single" w:sz="1" w:space="0" w:color="CCCCCC"/>
-            </w:tcBorders>
-            <w:shd w:val="clear" w:color="auto" w:fill="1A3C5E"/>
-            <w:tcMar>
-              <w:top w:w="100" w:type="dxa"/>
-              <w:left w:w="140" w:type="dxa"/>
-              <w:bottom w:w="100" w:type="dxa"/>
-              <w:right w:w="140" w:type="dxa"/>
-            </w:tcMar>
-            <w:vAlign w:val="center"/>
-          </w:tcPr>
-          <w:p>
-            <w:r>
-              <w:rPr>
-                <w:b/>
-                <w:bCs/>
-                <w:color w:val="FFFFFF"/>
-                <w:sz w:val="20"/>
-                <w:szCs w:val="20"/>
-              </w:rPr>
-              <w:t>Sprint</w:t>
-            </w:r>
-          </w:p>
-        </w:tc>
-        <w:tc>
-          <w:tcPr>
-            <w:tcW w:w="3000" w:type="dxa"/>
-            <w:tcBorders>
-              <w:top w:val="single" w:sz="1" w:space="0" w:color="CCCCCC"/>
-              <w:left w:val="single" w:sz="1" w:space="0" w:color="CCCCCC"/>
-              <w:bottom w:val="single" w:sz="1" w:space="0" w:color="CCCCCC"/>
-              <w:right w:val="single" w:sz="1" w:space="0" w:color="CCCCCC"/>
-            </w:tcBorders>
-            <w:shd w:val="clear" w:color="auto" w:fill="1A3C5E"/>
-            <w:tcMar>
-              <w:top w:w="100" w:type="dxa"/>
-              <w:left w:w="140" w:type="dxa"/>
-              <w:bottom w:w="100" w:type="dxa"/>
-              <w:right w:w="140" w:type="dxa"/>
-            </w:tcMar>
-            <w:vAlign w:val="center"/>
-          </w:tcPr>
-          <w:p>
-            <w:r>
-              <w:rPr>
-                <w:b/>
-                <w:bCs/>
-                <w:color w:val="FFFFFF"/>
-                <w:sz w:val="20"/>
-                <w:szCs w:val="20"/>
-              </w:rPr>
-              <w:t>Build</w:t>
-            </w:r>
-          </w:p>
-        </w:tc>
-        <w:tc>
-          <w:tcPr>
-            <w:tcW w:w="5160" w:type="dxa"/>
-            <w:tcBorders>
-              <w:top w:val="single" w:sz="1" w:space="0" w:color="CCCCCC"/>
-              <w:left w:val="single" w:sz="1" w:space="0" w:color="CCCCCC"/>
-              <w:bottom w:val="single" w:sz="1" w:space="0" w:color="CCCCCC"/>
-              <w:right w:val="single" w:sz="1" w:space="0" w:color="CCCCCC"/>
-            </w:tcBorders>
-            <w:shd w:val="clear" w:color="auto" w:fill="1A3C5E"/>
-            <w:tcMar>
-              <w:top w:w="100" w:type="dxa"/>
-              <w:left w:w="140" w:type="dxa"/>
-              <w:bottom w:w="100" w:type="dxa"/>
-              <w:right w:w="140" w:type="dxa"/>
-            </w:tcMar>
-            <w:vAlign w:val="center"/>
-          </w:tcPr>
-          <w:p>
-            <w:r>
-              <w:rPr>
-                <w:b/>
-                <w:bCs/>
-                <w:color w:val="FFFFFF"/>
-                <w:sz w:val="20"/>
-                <w:szCs w:val="20"/>
-              </w:rPr>
-              <w:t>Rationale</w:t>
-            </w:r>
-          </w:p>
-        </w:tc>
-      </w:tr>
-      <w:tr>
-        <w:tblPrEx>
-          <w:tblCellMar>
-            <w:top w:w="0" w:type="dxa"/>
-            <w:bottom w:w="0" w:type="dxa"/>
-          </w:tblCellMar>
-        </w:tblPrEx>
-        <w:tc>
-          <w:tcPr>
-            <w:tcW w:w="1200" w:type="dxa"/>
-            <w:tcBorders>
-              <w:top w:val="single" w:sz="1" w:space="0" w:color="CCCCCC"/>
-              <w:left w:val="single" w:sz="1" w:space="0" w:color="CCCCCC"/>
-              <w:bottom w:val="single" w:sz="1" w:space="0" w:color="CCCCCC"/>
-              <w:right w:val="single" w:sz="1" w:space="0" w:color="CCCCCC"/>
-            </w:tcBorders>
-            <w:shd w:val="clear" w:color="auto" w:fill="FFFFFF"/>
-            <w:tcMar>
-              <w:top w:w="100" w:type="dxa"/>
-              <w:left w:w="140" w:type="dxa"/>
-              <w:bottom w:w="100" w:type="dxa"/>
-              <w:right w:w="140" w:type="dxa"/>
-            </w:tcMar>
-            <w:vAlign w:val="center"/>
-          </w:tcPr>
-          <w:p>
-            <w:r>
-              <w:rPr>
-                <w:color w:val="1A1A1A"/>
-                <w:sz w:val="20"/>
-                <w:szCs w:val="20"/>
-              </w:rPr>
-              <w:t>Sprint 1</w:t>
-            </w:r>
-          </w:p>
-        </w:tc>
-        <w:tc>
-          <w:tcPr>
-            <w:tcW w:w="3000" w:type="dxa"/>
-            <w:tcBorders>
-              <w:top w:val="single" w:sz="1" w:space="0" w:color="CCCCCC"/>
-              <w:left w:val="single" w:sz="1" w:space="0" w:color="CCCCCC"/>
-              <w:bottom w:val="single" w:sz="1" w:space="0" w:color="CCCCCC"/>
-              <w:right w:val="single" w:sz="1" w:space="0" w:color="CCCCCC"/>
-            </w:tcBorders>
-            <w:shd w:val="clear" w:color="auto" w:fill="FFFFFF"/>
-            <w:tcMar>
-              <w:top w:w="100" w:type="dxa"/>
-              <w:left w:w="140" w:type="dxa"/>
-              <w:bottom w:w="100" w:type="dxa"/>
-              <w:right w:w="140" w:type="dxa"/>
-            </w:tcMar>
-            <w:vAlign w:val="center"/>
-          </w:tcPr>
-          <w:p>
-            <w:r>
-              <w:rPr>
-                <w:color w:val="1A1A1A"/>
-                <w:sz w:val="20"/>
-                <w:szCs w:val="20"/>
-              </w:rPr>
-              <w:t>Smart Count (no-freeze cycle counting)</w:t>
-            </w:r>
-          </w:p>
-        </w:tc>
-        <w:tc>
-          <w:tcPr>
-            <w:tcW w:w="5160" w:type="dxa"/>
-            <w:tcBorders>
-              <w:top w:val="single" w:sz="1" w:space="0" w:color="CCCCCC"/>
-              <w:left w:val="single" w:sz="1" w:space="0" w:color="CCCCCC"/>
-              <w:bottom w:val="single" w:sz="1" w:space="0" w:color="CCCCCC"/>
-              <w:right w:val="single" w:sz="1" w:space="0" w:color="CCCCCC"/>
-            </w:tcBorders>
-            <w:shd w:val="clear" w:color="auto" w:fill="FFFFFF"/>
-            <w:tcMar>
-              <w:top w:w="100" w:type="dxa"/>
-              <w:left w:w="140" w:type="dxa"/>
-              <w:bottom w:w="100" w:type="dxa"/>
-              <w:right w:w="140" w:type="dxa"/>
-            </w:tcMar>
-            <w:vAlign w:val="center"/>
-          </w:tcPr>
-          <w:p>
-            <w:r>
-              <w:rPr>
-                <w:color w:val="1A1A1A"/>
-                <w:sz w:val="20"/>
-                <w:szCs w:val="20"/>
-              </w:rPr>
-              <w:t>Self-contained, low risk, improves accuracy for existing cycle count users immediately</w:t>
-            </w:r>
-          </w:p>
-        </w:tc>
-      </w:tr>
-      <w:tr>
-        <w:tblPrEx>
-          <w:tblCellMar>
-            <w:top w:w="0" w:type="dxa"/>
-            <w:bottom w:w="0" w:type="dxa"/>
-          </w:tblCellMar>
-        </w:tblPrEx>
-        <w:tc>
-          <w:tcPr>
-            <w:tcW w:w="1200" w:type="dxa"/>
-            <w:tcBorders>
-              <w:top w:val="single" w:sz="1" w:space="0" w:color="CCCCCC"/>
-              <w:left w:val="single" w:sz="1" w:space="0" w:color="CCCCCC"/>
-              <w:bottom w:val="single" w:sz="1" w:space="0" w:color="CCCCCC"/>
-              <w:right w:val="single" w:sz="1" w:space="0" w:color="CCCCCC"/>
-            </w:tcBorders>
-            <w:shd w:val="clear" w:color="auto" w:fill="F0F5FA"/>
-            <w:tcMar>
-              <w:top w:w="100" w:type="dxa"/>
-              <w:left w:w="140" w:type="dxa"/>
-              <w:bottom w:w="100" w:type="dxa"/>
-              <w:right w:w="140" w:type="dxa"/>
-            </w:tcMar>
-            <w:vAlign w:val="center"/>
-          </w:tcPr>
-          <w:p>
-            <w:r>
-              <w:rPr>
-                <w:color w:val="1A1A1A"/>
-                <w:sz w:val="20"/>
-                <w:szCs w:val="20"/>
-              </w:rPr>
-              <w:t>Sprint 2</w:t>
-            </w:r>
-          </w:p>
-        </w:tc>
-        <w:tc>
-          <w:tcPr>
-            <w:tcW w:w="3000" w:type="dxa"/>
-            <w:tcBorders>
-              <w:top w:val="single" w:sz="1" w:space="0" w:color="CCCCCC"/>
-              <w:left w:val="single" w:sz="1" w:space="0" w:color="CCCCCC"/>
-              <w:bottom w:val="single" w:sz="1" w:space="0" w:color="CCCCCC"/>
-              <w:right w:val="single" w:sz="1" w:space="0" w:color="CCCCCC"/>
-            </w:tcBorders>
-            <w:shd w:val="clear" w:color="auto" w:fill="F0F5FA"/>
-            <w:tcMar>
-              <w:top w:w="100" w:type="dxa"/>
-              <w:left w:w="140" w:type="dxa"/>
-              <w:bottom w:w="100" w:type="dxa"/>
-              <w:right w:w="140" w:type="dxa"/>
-            </w:tcMar>
-            <w:vAlign w:val="center"/>
-          </w:tcPr>
-          <w:p>
-            <w:r>
-              <w:rPr>
-                <w:color w:val="1A1A1A"/>
-                <w:sz w:val="20"/>
-                <w:szCs w:val="20"/>
-              </w:rPr>
-              <w:t>Return Authorization receiving</w:t>
-            </w:r>
-          </w:p>
-        </w:tc>
-        <w:tc>
-          <w:tcPr>
-            <w:tcW w:w="5160" w:type="dxa"/>
-            <w:tcBorders>
-              <w:top w:val="single" w:sz="1" w:space="0" w:color="CCCCCC"/>
-              <w:left w:val="single" w:sz="1" w:space="0" w:color="CCCCCC"/>
-              <w:bottom w:val="single" w:sz="1" w:space="0" w:color="CCCCCC"/>
-              <w:right w:val="single" w:sz="1" w:space="0" w:color="CCCCCC"/>
-            </w:tcBorders>
-            <w:shd w:val="clear" w:color="auto" w:fill="F0F5FA"/>
-            <w:tcMar>
-              <w:top w:w="100" w:type="dxa"/>
-              <w:left w:w="140" w:type="dxa"/>
-              <w:bottom w:w="100" w:type="dxa"/>
-              <w:right w:w="140" w:type="dxa"/>
-            </w:tcMar>
-            <w:vAlign w:val="center"/>
-          </w:tcPr>
-          <w:p>
-            <w:r>
-              <w:rPr>
-                <w:color w:val="1A1A1A"/>
-                <w:sz w:val="20"/>
-                <w:szCs w:val="20"/>
-              </w:rPr>
-              <w:t>Contained data model addition; unlocks B2C and regulated goods clients</w:t>
-            </w:r>
-          </w:p>
-        </w:tc>
-      </w:tr>
-      <w:tr>
-        <w:tblPrEx>
-          <w:tblCellMar>
-            <w:top w:w="0" w:type="dxa"/>
-            <w:bottom w:w="0" w:type="dxa"/>
-          </w:tblCellMar>
-        </w:tblPrEx>
-        <w:tc>
-          <w:tcPr>
-            <w:tcW w:w="1200" w:type="dxa"/>
-            <w:tcBorders>
-              <w:top w:val="single" w:sz="1" w:space="0" w:color="CCCCCC"/>
-              <w:left w:val="single" w:sz="1" w:space="0" w:color="CCCCCC"/>
-              <w:bottom w:val="single" w:sz="1" w:space="0" w:color="CCCCCC"/>
-              <w:right w:val="single" w:sz="1" w:space="0" w:color="CCCCCC"/>
-            </w:tcBorders>
-            <w:shd w:val="clear" w:color="auto" w:fill="FFFFFF"/>
-            <w:tcMar>
-              <w:top w:w="100" w:type="dxa"/>
-              <w:left w:w="140" w:type="dxa"/>
-              <w:bottom w:w="100" w:type="dxa"/>
-              <w:right w:w="140" w:type="dxa"/>
-            </w:tcMar>
-            <w:vAlign w:val="center"/>
-          </w:tcPr>
-          <w:p>
-            <w:r>
-              <w:rPr>
-                <w:color w:val="1A1A1A"/>
-                <w:sz w:val="20"/>
-                <w:szCs w:val="20"/>
-              </w:rPr>
-              <w:t>Sprint 3–4</w:t>
-            </w:r>
-          </w:p>
-        </w:tc>
-        <w:tc>
-          <w:tcPr>
-            <w:tcW w:w="3000" w:type="dxa"/>
-            <w:tcBorders>
-              <w:top w:val="single" w:sz="1" w:space="0" w:color="CCCCCC"/>
-              <w:left w:val="single" w:sz="1" w:space="0" w:color="CCCCCC"/>
-              <w:bottom w:val="single" w:sz="1" w:space="0" w:color="CCCCCC"/>
-              <w:right w:val="single" w:sz="1" w:space="0" w:color="CCCCCC"/>
-            </w:tcBorders>
-            <w:shd w:val="clear" w:color="auto" w:fill="FFFFFF"/>
-            <w:tcMar>
-              <w:top w:w="100" w:type="dxa"/>
-              <w:left w:w="140" w:type="dxa"/>
-              <w:bottom w:w="100" w:type="dxa"/>
-              <w:right w:w="140" w:type="dxa"/>
-            </w:tcMar>
-            <w:vAlign w:val="center"/>
-          </w:tcPr>
-          <w:p>
-            <w:r>
-              <w:rPr>
-                <w:color w:val="1A1A1A"/>
-                <w:sz w:val="20"/>
-                <w:szCs w:val="20"/>
-              </w:rPr>
-              <w:t>Cross-location auto-assignment</w:t>
-            </w:r>
-          </w:p>
-        </w:tc>
-        <w:tc>
-          <w:tcPr>
-            <w:tcW w:w="5160" w:type="dxa"/>
-            <w:tcBorders>
-              <w:top w:val="single" w:sz="1" w:space="0" w:color="CCCCCC"/>
-              <w:left w:val="single" w:sz="1" w:space="0" w:color="CCCCCC"/>
-              <w:bottom w:val="single" w:sz="1" w:space="0" w:color="CCCCCC"/>
-              <w:right w:val="single" w:sz="1" w:space="0" w:color="CCCCCC"/>
-            </w:tcBorders>
-            <w:shd w:val="clear" w:color="auto" w:fill="FFFFFF"/>
-            <w:tcMar>
-              <w:top w:w="100" w:type="dxa"/>
-              <w:left w:w="140" w:type="dxa"/>
-              <w:bottom w:w="100" w:type="dxa"/>
-              <w:right w:w="140" w:type="dxa"/>
-            </w:tcMar>
-            <w:vAlign w:val="center"/>
-          </w:tcPr>
-          <w:p>
-            <w:r>
-              <w:rPr>
-                <w:color w:val="1A1A1A"/>
-                <w:sz w:val="20"/>
-                <w:szCs w:val="20"/>
-              </w:rPr>
-              <w:t>Depends on stable pick list flow; higher value once client has multiple warehouses</w:t>
-            </w:r>
-          </w:p>
-        </w:tc>
-      </w:tr>
-      <w:tr>
-        <w:tblPrEx>
-          <w:tblCellMar>
-            <w:top w:w="0" w:type="dxa"/>
-            <w:bottom w:w="0" w:type="dxa"/>
-          </w:tblCellMar>
-        </w:tblPrEx>
-        <w:tc>
-          <w:tcPr>
-            <w:tcW w:w="1200" w:type="dxa"/>
-            <w:tcBorders>
-              <w:top w:val="single" w:sz="1" w:space="0" w:color="CCCCCC"/>
-              <w:left w:val="single" w:sz="1" w:space="0" w:color="CCCCCC"/>
-              <w:bottom w:val="single" w:sz="1" w:space="0" w:color="CCCCCC"/>
-              <w:right w:val="single" w:sz="1" w:space="0" w:color="CCCCCC"/>
-            </w:tcBorders>
-            <w:shd w:val="clear" w:color="auto" w:fill="F0F5FA"/>
-            <w:tcMar>
-              <w:top w:w="100" w:type="dxa"/>
-              <w:left w:w="140" w:type="dxa"/>
-              <w:bottom w:w="100" w:type="dxa"/>
-              <w:right w:w="140" w:type="dxa"/>
-            </w:tcMar>
-            <w:vAlign w:val="center"/>
-          </w:tcPr>
-          <w:p>
-            <w:r>
-              <w:rPr>
-                <w:color w:val="1A1A1A"/>
-                <w:sz w:val="20"/>
-                <w:szCs w:val="20"/>
-              </w:rPr>
-              <w:lastRenderedPageBreak/>
-              <w:t>Sprint 5–6</w:t>
-            </w:r>
-          </w:p>
-        </w:tc>
-        <w:tc>
-          <w:tcPr>
-            <w:tcW w:w="3000" w:type="dxa"/>
-            <w:tcBorders>
-              <w:top w:val="single" w:sz="1" w:space="0" w:color="CCCCCC"/>
-              <w:left w:val="single" w:sz="1" w:space="0" w:color="CCCCCC"/>
-              <w:bottom w:val="single" w:sz="1" w:space="0" w:color="CCCCCC"/>
-              <w:right w:val="single" w:sz="1" w:space="0" w:color="CCCCCC"/>
-            </w:tcBorders>
-            <w:shd w:val="clear" w:color="auto" w:fill="F0F5FA"/>
-            <w:tcMar>
-              <w:top w:w="100" w:type="dxa"/>
-              <w:left w:w="140" w:type="dxa"/>
-              <w:bottom w:w="100" w:type="dxa"/>
-              <w:right w:w="140" w:type="dxa"/>
-            </w:tcMar>
-            <w:vAlign w:val="center"/>
-          </w:tcPr>
-          <w:p>
-            <w:r>
-              <w:rPr>
-                <w:color w:val="1A1A1A"/>
-                <w:sz w:val="20"/>
-                <w:szCs w:val="20"/>
-              </w:rPr>
-              <w:t>PWA (offline + home screen)</w:t>
-            </w:r>
-          </w:p>
-        </w:tc>
-        <w:tc>
-          <w:tcPr>
-            <w:tcW w:w="5160" w:type="dxa"/>
-            <w:tcBorders>
-              <w:top w:val="single" w:sz="1" w:space="0" w:color="CCCCCC"/>
-              <w:left w:val="single" w:sz="1" w:space="0" w:color="CCCCCC"/>
-              <w:bottom w:val="single" w:sz="1" w:space="0" w:color="CCCCCC"/>
-              <w:right w:val="single" w:sz="1" w:space="0" w:color="CCCCCC"/>
-            </w:tcBorders>
-            <w:shd w:val="clear" w:color="auto" w:fill="F0F5FA"/>
-            <w:tcMar>
-              <w:top w:w="100" w:type="dxa"/>
-              <w:left w:w="140" w:type="dxa"/>
-              <w:bottom w:w="100" w:type="dxa"/>
-              <w:right w:w="140" w:type="dxa"/>
-            </w:tcMar>
-            <w:vAlign w:val="center"/>
-          </w:tcPr>
-          <w:p>
-            <w:r>
-              <w:rPr>
-                <w:color w:val="1A1A1A"/>
-                <w:sz w:val="20"/>
-                <w:szCs w:val="20"/>
-              </w:rPr>
-              <w:t>Zero codebase architecture change; immediately improves all mobile operator UX</w:t>
-            </w:r>
-          </w:p>
-        </w:tc>
-      </w:tr>
-      <w:tr>
-        <w:tblPrEx>
-          <w:tblCellMar>
-            <w:top w:w="0" w:type="dxa"/>
-            <w:bottom w:w="0" w:type="dxa"/>
-          </w:tblCellMar>
-        </w:tblPrEx>
-        <w:tc>
-          <w:tcPr>
-            <w:tcW w:w="1200" w:type="dxa"/>
-            <w:tcBorders>
-              <w:top w:val="single" w:sz="1" w:space="0" w:color="CCCCCC"/>
-              <w:left w:val="single" w:sz="1" w:space="0" w:color="CCCCCC"/>
-              <w:bottom w:val="single" w:sz="1" w:space="0" w:color="CCCCCC"/>
-              <w:right w:val="single" w:sz="1" w:space="0" w:color="CCCCCC"/>
-            </w:tcBorders>
-            <w:shd w:val="clear" w:color="auto" w:fill="FFFFFF"/>
-            <w:tcMar>
-              <w:top w:w="100" w:type="dxa"/>
-              <w:left w:w="140" w:type="dxa"/>
-              <w:bottom w:w="100" w:type="dxa"/>
-              <w:right w:w="140" w:type="dxa"/>
-            </w:tcMar>
-            <w:vAlign w:val="center"/>
-          </w:tcPr>
-          <w:p>
-            <w:r>
-              <w:rPr>
-                <w:color w:val="1A1A1A"/>
-                <w:sz w:val="20"/>
-                <w:szCs w:val="20"/>
-              </w:rPr>
-              <w:t>Sprint 7–10</w:t>
-            </w:r>
-          </w:p>
-        </w:tc>
-        <w:tc>
-          <w:tcPr>
-            <w:tcW w:w="3000" w:type="dxa"/>
-            <w:tcBorders>
-              <w:top w:val="single" w:sz="1" w:space="0" w:color="CCCCCC"/>
-              <w:left w:val="single" w:sz="1" w:space="0" w:color="CCCCCC"/>
-              <w:bottom w:val="single" w:sz="1" w:space="0" w:color="CCCCCC"/>
-              <w:right w:val="single" w:sz="1" w:space="0" w:color="CCCCCC"/>
-            </w:tcBorders>
-            <w:shd w:val="clear" w:color="auto" w:fill="FFFFFF"/>
-            <w:tcMar>
-              <w:top w:w="100" w:type="dxa"/>
-              <w:left w:w="140" w:type="dxa"/>
-              <w:bottom w:w="100" w:type="dxa"/>
-              <w:right w:w="140" w:type="dxa"/>
-            </w:tcMar>
-            <w:vAlign w:val="center"/>
-          </w:tcPr>
-          <w:p>
-            <w:r>
-              <w:rPr>
-                <w:color w:val="1A1A1A"/>
-                <w:sz w:val="20"/>
-                <w:szCs w:val="20"/>
-              </w:rPr>
-              <w:t>Capacitor native app (optional)</w:t>
-            </w:r>
-          </w:p>
-        </w:tc>
-        <w:tc>
-          <w:tcPr>
-            <w:tcW w:w="5160" w:type="dxa"/>
-            <w:tcBorders>
-              <w:top w:val="single" w:sz="1" w:space="0" w:color="CCCCCC"/>
-              <w:left w:val="single" w:sz="1" w:space="0" w:color="CCCCCC"/>
-              <w:bottom w:val="single" w:sz="1" w:space="0" w:color="CCCCCC"/>
-              <w:right w:val="single" w:sz="1" w:space="0" w:color="CCCCCC"/>
-            </w:tcBorders>
-            <w:shd w:val="clear" w:color="auto" w:fill="FFFFFF"/>
-            <w:tcMar>
-              <w:top w:w="100" w:type="dxa"/>
-              <w:left w:w="140" w:type="dxa"/>
-              <w:bottom w:w="100" w:type="dxa"/>
-              <w:right w:w="140" w:type="dxa"/>
-            </w:tcMar>
-            <w:vAlign w:val="center"/>
-          </w:tcPr>
-          <w:p>
-            <w:r>
-              <w:rPr>
-                <w:color w:val="1A1A1A"/>
-                <w:sz w:val="20"/>
-                <w:szCs w:val="20"/>
-              </w:rPr>
-              <w:t>Only needed if Zebra hardware trigger scanning or push notifications are a client requirement</w:t>
-            </w:r>
-          </w:p>
-        </w:tc>
-      </w:tr>
-    </w:tbl>
-    <w:p>
-      <w:pPr>
-        <w:spacing w:before="80" w:after="80"/>
-      </w:pPr>
-    </w:p>
-    <w:p>
-      <w:pPr>
-        <w:spacing w:before="80" w:after="80"/>
-      </w:pPr>
-    </w:p>
-    <w:p>
-      <w:pPr>
-        <w:pBdr>
-          <w:bottom w:val="single" w:sz="6" w:space="1" w:color="1A3C5E"/>
-        </w:pBdr>
-        <w:spacing w:before="120" w:after="120"/>
-      </w:pPr>
-    </w:p>
-    <w:p>
-      <w:pPr>
-        <w:spacing w:before="120"/>
-        <w:jc w:val="center"/>
-      </w:pPr>
+        <w:t xml:space="preserve">   |   May 202</w:t>
+      </w:r>
       <w:r>
         <w:rPr>
           <w:color w:val="999999"/>
           <w:sz w:val="18"/>
           <w:szCs w:val="18"/>
         </w:rPr>
-        <w:t xml:space="preserve">Internal Developer Guide   |   Warehouse Wizard   |   </w:t>
-      </w:r>
-      <w:hyperlink r:id="rId10" w:history="1">
-        <w:proofErr w:type="spellStart"/>
-        <w:r>
-          <w:rPr>
-            <w:color w:val="2E5F8A"/>
-            <w:sz w:val="18"/>
-            <w:szCs w:val="18"/>
-            <w:u w:val="single"/>
-          </w:rPr>
-          <w:t>warehousewizard.app</w:t>
-        </w:r>
-        <w:proofErr w:type="spellEnd"/>
-      </w:hyperlink>
+        <w:t>6</w:t>
+      </w:r>
     </w:p>
     <w:sectPr>
-      <w:headerReference w:type="default" r:id="rId11"/>
-      <w:footerReference w:type="default" r:id="rId12"/>
+      <w:headerReference w:type="default" r:id="rId8"/>
+      <w:footerReference w:type="default" r:id="rId9"/>
       <w:pgSz w:w="12240" w:h="15840"/>
       <w:pgMar w:top="1080" w:right="1080" w:bottom="1080" w:left="1080" w:header="708" w:footer="708" w:gutter="0"/>
       <w:cols w:space="720"/>
@@ -7803,89 +4320,6 @@
 </file>
 
 <file path=word/footer1.xml><?xml version="1.0" encoding="utf-8"?>
-<w:ftr xmlns:wpc="http://schemas.microsoft.com/office/word/2010/wordprocessingCanvas" xmlns:cx="http://schemas.microsoft.com/office/drawing/2014/chartex" xmlns:cx1="http://schemas.microsoft.com/office/drawing/2015/9/8/chartex" xmlns:cx2="http://schemas.microsoft.com/office/drawing/2015/10/21/chartex" xmlns:cx3="http://schemas.microsoft.com/office/drawing/2016/5/9/chartex" xmlns:cx4="http://schemas.microsoft.com/office/drawing/2016/5/10/chartex" xmlns:cx5="http://schemas.microsoft.com/office/drawing/2016/5/11/chartex" xmlns:cx6="http://schemas.microsoft.com/office/drawing/2016/5/12/chartex" xmlns:cx7="http://schemas.microsoft.com/office/drawing/2016/5/13/chartex" xmlns:cx8="http://schemas.microsoft.com/office/drawing/2016/5/14/chartex" xmlns:mc="http://schemas.openxmlformats.org/markup-compatibility/2006" xmlns:aink="http://schemas.microsoft.com/office/drawing/2016/ink" xmlns:am3d="http://schemas.microsoft.com/office/drawing/2017/model3d" xmlns:o="urn:schemas-microsoft-com:office:office" xmlns:oel="http://schemas.microsoft.com/office/2019/extlst" xmlns:r="http://schemas.openxmlformats.org/officeDocument/2006/relationships" xmlns:m="http://schemas.openxmlformats.org/officeDocument/2006/math" xmlns:v="urn:schemas-microsoft-com:vml" xmlns:wp14="http://schemas.microsoft.com/office/word/2010/wordprocessingDrawing" xmlns:wp="http://schemas.openxmlformats.org/drawingml/2006/wordprocessingDrawing" xmlns:w10="urn:schemas-microsoft-com:office:word" xmlns:w="http://schemas.openxmlformats.org/wordprocessingml/2006/main" xmlns:w14="http://schemas.microsoft.com/office/word/2010/wordml" xmlns:w15="http://schemas.microsoft.com/office/word/2012/wordml" xmlns:w16cex="http://schemas.microsoft.com/office/word/2018/wordml/cex" xmlns:w16cid="http://schemas.microsoft.com/office/word/2016/wordml/cid" xmlns:w16="http://schemas.microsoft.com/office/word/2018/wordml" xmlns:w16du="http://schemas.microsoft.com/office/word/2023/wordml/word16du" xmlns:w16sdtdh="http://schemas.microsoft.com/office/word/2020/wordml/sdtdatahash" xmlns:w16sdtfl="http://schemas.microsoft.com/office/word/2024/wordml/sdtformatlock" xmlns:w16se="http://schemas.microsoft.com/office/word/2015/wordml/symex" xmlns:wpg="http://schemas.microsoft.com/office/word/2010/wordprocessingGroup" xmlns:wpi="http://schemas.microsoft.com/office/word/2010/wordprocessingInk" xmlns:wne="http://schemas.microsoft.com/office/word/2006/wordml" xmlns:wps="http://schemas.microsoft.com/office/word/2010/wordprocessingShape" mc:Ignorable="w14 w15 w16se w16cid w16 w16cex w16sdtdh w16sdtfl w16du wp14">
-  <w:p>
-    <w:pPr>
-      <w:pBdr>
-        <w:top w:val="single" w:sz="4" w:space="1" w:color="1A3C5E"/>
-      </w:pBdr>
-      <w:tabs>
-        <w:tab w:val="left" w:pos="9360"/>
-      </w:tabs>
-    </w:pPr>
-    <w:r>
-      <w:rPr>
-        <w:color w:val="999999"/>
-        <w:sz w:val="16"/>
-        <w:szCs w:val="16"/>
-      </w:rPr>
-      <w:t xml:space="preserve">CONFIDENTIAL   |   </w:t>
-    </w:r>
-    <w:proofErr w:type="spellStart"/>
-    <w:r>
-      <w:rPr>
-        <w:color w:val="999999"/>
-        <w:sz w:val="16"/>
-        <w:szCs w:val="16"/>
-      </w:rPr>
-      <w:t>warehousewizard.app</w:t>
-    </w:r>
-    <w:proofErr w:type="spellEnd"/>
-    <w:r>
-      <w:rPr>
-        <w:color w:val="999999"/>
-        <w:sz w:val="16"/>
-        <w:szCs w:val="16"/>
-      </w:rPr>
-      <w:tab/>
-      <w:t xml:space="preserve">Page </w:t>
-    </w:r>
-    <w:r>
-      <w:rPr>
-        <w:color w:val="999999"/>
-        <w:sz w:val="16"/>
-        <w:szCs w:val="16"/>
-      </w:rPr>
-      <w:fldChar w:fldCharType="begin"/>
-    </w:r>
-    <w:r>
-      <w:rPr>
-        <w:color w:val="999999"/>
-        <w:sz w:val="16"/>
-        <w:szCs w:val="16"/>
-      </w:rPr>
-      <w:instrText>PAGE</w:instrText>
-    </w:r>
-    <w:r>
-      <w:rPr>
-        <w:color w:val="999999"/>
-        <w:sz w:val="16"/>
-        <w:szCs w:val="16"/>
-      </w:rPr>
-      <w:fldChar w:fldCharType="separate"/>
-    </w:r>
-    <w:r>
-      <w:rPr>
-        <w:noProof/>
-        <w:color w:val="999999"/>
-        <w:sz w:val="16"/>
-        <w:szCs w:val="16"/>
-      </w:rPr>
-      <w:t>1</w:t>
-    </w:r>
-    <w:r>
-      <w:rPr>
-        <w:color w:val="999999"/>
-        <w:sz w:val="16"/>
-        <w:szCs w:val="16"/>
-      </w:rPr>
-      <w:fldChar w:fldCharType="end"/>
-    </w:r>
-  </w:p>
-</w:ftr>
-</file>
-
-<file path=word/footer2.xml><?xml version="1.0" encoding="utf-8"?>
 <w:ftr xmlns:wpc="http://schemas.microsoft.com/office/word/2010/wordprocessingCanvas" xmlns:cx="http://schemas.microsoft.com/office/drawing/2014/chartex" xmlns:cx1="http://schemas.microsoft.com/office/drawing/2015/9/8/chartex" xmlns:cx2="http://schemas.microsoft.com/office/drawing/2015/10/21/chartex" xmlns:cx3="http://schemas.microsoft.com/office/drawing/2016/5/9/chartex" xmlns:cx4="http://schemas.microsoft.com/office/drawing/2016/5/10/chartex" xmlns:cx5="http://schemas.microsoft.com/office/drawing/2016/5/11/chartex" xmlns:cx6="http://schemas.microsoft.com/office/drawing/2016/5/12/chartex" xmlns:cx7="http://schemas.microsoft.com/office/drawing/2016/5/13/chartex" xmlns:cx8="http://schemas.microsoft.com/office/drawing/2016/5/14/chartex" xmlns:mc="http://schemas.openxmlformats.org/markup-compatibility/2006" xmlns:aink="http://schemas.microsoft.com/office/drawing/2016/ink" xmlns:am3d="http://schemas.microsoft.com/office/drawing/2017/model3d" xmlns:o="urn:schemas-microsoft-com:office:office" xmlns:oel="http://schemas.microsoft.com/office/2019/extlst" xmlns:r="http://schemas.openxmlformats.org/officeDocument/2006/relationships" xmlns:m="http://schemas.openxmlformats.org/officeDocument/2006/math" xmlns:v="urn:schemas-microsoft-com:vml" xmlns:wp14="http://schemas.microsoft.com/office/word/2010/wordprocessingDrawing" xmlns:wp="http://schemas.openxmlformats.org/drawingml/2006/wordprocessingDrawing" xmlns:w10="urn:schemas-microsoft-com:office:word" xmlns:w="http://schemas.openxmlformats.org/wordprocessingml/2006/main" xmlns:w14="http://schemas.microsoft.com/office/word/2010/wordml" xmlns:w15="http://schemas.microsoft.com/office/word/2012/wordml" xmlns:w16cex="http://schemas.microsoft.com/office/word/2018/wordml/cex" xmlns:w16cid="http://schemas.microsoft.com/office/word/2016/wordml/cid" xmlns:w16="http://schemas.microsoft.com/office/word/2018/wordml" xmlns:w16du="http://schemas.microsoft.com/office/word/2023/wordml/word16du" xmlns:w16sdtdh="http://schemas.microsoft.com/office/word/2020/wordml/sdtdatahash" xmlns:w16sdtfl="http://schemas.microsoft.com/office/word/2024/wordml/sdtformatlock" xmlns:w16se="http://schemas.microsoft.com/office/word/2015/wordml/symex" xmlns:wpg="http://schemas.microsoft.com/office/word/2010/wordprocessingGroup" xmlns:wpi="http://schemas.microsoft.com/office/word/2010/wordprocessingInk" xmlns:wne="http://schemas.microsoft.com/office/word/2006/wordml" xmlns:wps="http://schemas.microsoft.com/office/word/2010/wordprocessingShape" mc:Ignorable="w14 w15 w16se w16cid w16 w16cex w16sdtdh w16sdtfl w16du wp14">
   <w:p>
     <w:pPr>
@@ -7988,48 +4422,6 @@
 </file>
 
 <file path=word/header1.xml><?xml version="1.0" encoding="utf-8"?>
-<w:hdr xmlns:wpc="http://schemas.microsoft.com/office/word/2010/wordprocessingCanvas" xmlns:cx="http://schemas.microsoft.com/office/drawing/2014/chartex" xmlns:cx1="http://schemas.microsoft.com/office/drawing/2015/9/8/chartex" xmlns:cx2="http://schemas.microsoft.com/office/drawing/2015/10/21/chartex" xmlns:cx3="http://schemas.microsoft.com/office/drawing/2016/5/9/chartex" xmlns:cx4="http://schemas.microsoft.com/office/drawing/2016/5/10/chartex" xmlns:cx5="http://schemas.microsoft.com/office/drawing/2016/5/11/chartex" xmlns:cx6="http://schemas.microsoft.com/office/drawing/2016/5/12/chartex" xmlns:cx7="http://schemas.microsoft.com/office/drawing/2016/5/13/chartex" xmlns:cx8="http://schemas.microsoft.com/office/drawing/2016/5/14/chartex" xmlns:mc="http://schemas.openxmlformats.org/markup-compatibility/2006" xmlns:aink="http://schemas.microsoft.com/office/drawing/2016/ink" xmlns:am3d="http://schemas.microsoft.com/office/drawing/2017/model3d" xmlns:o="urn:schemas-microsoft-com:office:office" xmlns:oel="http://schemas.microsoft.com/office/2019/extlst" xmlns:r="http://schemas.openxmlformats.org/officeDocument/2006/relationships" xmlns:m="http://schemas.openxmlformats.org/officeDocument/2006/math" xmlns:v="urn:schemas-microsoft-com:vml" xmlns:wp14="http://schemas.microsoft.com/office/word/2010/wordprocessingDrawing" xmlns:wp="http://schemas.openxmlformats.org/drawingml/2006/wordprocessingDrawing" xmlns:w10="urn:schemas-microsoft-com:office:word" xmlns:w="http://schemas.openxmlformats.org/wordprocessingml/2006/main" xmlns:w14="http://schemas.microsoft.com/office/word/2010/wordml" xmlns:w15="http://schemas.microsoft.com/office/word/2012/wordml" xmlns:w16cex="http://schemas.microsoft.com/office/word/2018/wordml/cex" xmlns:w16cid="http://schemas.microsoft.com/office/word/2016/wordml/cid" xmlns:w16="http://schemas.microsoft.com/office/word/2018/wordml" xmlns:w16du="http://schemas.microsoft.com/office/word/2023/wordml/word16du" xmlns:w16sdtdh="http://schemas.microsoft.com/office/word/2020/wordml/sdtdatahash" xmlns:w16sdtfl="http://schemas.microsoft.com/office/word/2024/wordml/sdtformatlock" xmlns:w16se="http://schemas.microsoft.com/office/word/2015/wordml/symex" xmlns:wpg="http://schemas.microsoft.com/office/word/2010/wordprocessingGroup" xmlns:wpi="http://schemas.microsoft.com/office/word/2010/wordprocessingInk" xmlns:wne="http://schemas.microsoft.com/office/word/2006/wordml" xmlns:wps="http://schemas.microsoft.com/office/word/2010/wordprocessingShape" mc:Ignorable="w14 w15 w16se w16cid w16 w16cex w16sdtdh w16sdtfl w16du wp14">
-  <w:p>
-    <w:pPr>
-      <w:pBdr>
-        <w:bottom w:val="single" w:sz="4" w:space="1" w:color="1A3C5E"/>
-      </w:pBdr>
-      <w:tabs>
-        <w:tab w:val="left" w:pos="9360"/>
-      </w:tabs>
-    </w:pPr>
-    <w:r>
-      <w:rPr>
-        <w:b/>
-        <w:bCs/>
-        <w:color w:val="1A3C5E"/>
-        <w:sz w:val="18"/>
-        <w:szCs w:val="18"/>
-      </w:rPr>
-      <w:t>Warehouse Wizard Enterprise WMS</w:t>
-    </w:r>
-    <w:r>
-      <w:rPr>
-        <w:color w:val="666666"/>
-        <w:sz w:val="18"/>
-        <w:szCs w:val="18"/>
-      </w:rPr>
-      <w:t xml:space="preserve">   |   Client Decision Report</w:t>
-    </w:r>
-    <w:r>
-      <w:rPr>
-        <w:color w:val="999999"/>
-        <w:sz w:val="18"/>
-        <w:szCs w:val="18"/>
-      </w:rPr>
-      <w:tab/>
-      <w:t>May 2026</w:t>
-    </w:r>
-  </w:p>
-</w:hdr>
-</file>
-
-<file path=word/header2.xml><?xml version="1.0" encoding="utf-8"?>
 <w:hdr xmlns:wpc="http://schemas.microsoft.com/office/word/2010/wordprocessingCanvas" xmlns:cx="http://schemas.microsoft.com/office/drawing/2014/chartex" xmlns:cx1="http://schemas.microsoft.com/office/drawing/2015/9/8/chartex" xmlns:cx2="http://schemas.microsoft.com/office/drawing/2015/10/21/chartex" xmlns:cx3="http://schemas.microsoft.com/office/drawing/2016/5/9/chartex" xmlns:cx4="http://schemas.microsoft.com/office/drawing/2016/5/10/chartex" xmlns:cx5="http://schemas.microsoft.com/office/drawing/2016/5/11/chartex" xmlns:cx6="http://schemas.microsoft.com/office/drawing/2016/5/12/chartex" xmlns:cx7="http://schemas.microsoft.com/office/drawing/2016/5/13/chartex" xmlns:cx8="http://schemas.microsoft.com/office/drawing/2016/5/14/chartex" xmlns:mc="http://schemas.openxmlformats.org/markup-compatibility/2006" xmlns:aink="http://schemas.microsoft.com/office/drawing/2016/ink" xmlns:am3d="http://schemas.microsoft.com/office/drawing/2017/model3d" xmlns:o="urn:schemas-microsoft-com:office:office" xmlns:oel="http://schemas.microsoft.com/office/2019/extlst" xmlns:r="http://schemas.openxmlformats.org/officeDocument/2006/relationships" xmlns:m="http://schemas.openxmlformats.org/officeDocument/2006/math" xmlns:v="urn:schemas-microsoft-com:vml" xmlns:wp14="http://schemas.microsoft.com/office/word/2010/wordprocessingDrawing" xmlns:wp="http://schemas.openxmlformats.org/drawingml/2006/wordprocessingDrawing" xmlns:w10="urn:schemas-microsoft-com:office:word" xmlns:w="http://schemas.openxmlformats.org/wordprocessingml/2006/main" xmlns:w14="http://schemas.microsoft.com/office/word/2010/wordml" xmlns:w15="http://schemas.microsoft.com/office/word/2012/wordml" xmlns:w16cex="http://schemas.microsoft.com/office/word/2018/wordml/cex" xmlns:w16cid="http://schemas.microsoft.com/office/word/2016/wordml/cid" xmlns:w16="http://schemas.microsoft.com/office/word/2018/wordml" xmlns:w16du="http://schemas.microsoft.com/office/word/2023/wordml/word16du" xmlns:w16sdtdh="http://schemas.microsoft.com/office/word/2020/wordml/sdtdatahash" xmlns:w16sdtfl="http://schemas.microsoft.com/office/word/2024/wordml/sdtformatlock" xmlns:w16se="http://schemas.microsoft.com/office/word/2015/wordml/symex" xmlns:wpg="http://schemas.microsoft.com/office/word/2010/wordprocessingGroup" xmlns:wpi="http://schemas.microsoft.com/office/word/2010/wordprocessingInk" xmlns:wne="http://schemas.microsoft.com/office/word/2006/wordml" xmlns:wps="http://schemas.microsoft.com/office/word/2010/wordprocessingShape" mc:Ignorable="w14 w15 w16se w16cid w16 w16cex w16sdtdh w16sdtfl w16du wp14">
   <w:p>
     <w:pPr>

</xml_diff>